<commit_message>
Add editable table conversion mode
</commit_message>
<xml_diff>
--- a/samples/ejemplo-contabilidad-parroquia.docx
+++ b/samples/ejemplo-contabilidad-parroquia.docx
@@ -4,141 +4,64 @@
   <w:body>
     <w:p>
       <w:pPr>
-        <w:autoSpaceDN w:val="0"/>
-        <w:autoSpaceDE w:val="0"/>
-        <w:widowControl/>
-        <w:spacing w:line="220" w:lineRule="exact" w:before="0" w:after="140"/>
-        <w:ind w:left="0" w:right="0"/>
-      </w:pPr>
-    </w:p>
-    <w:p>
-      <w:pPr>
-        <w:autoSpaceDN w:val="0"/>
-        <w:autoSpaceDE w:val="0"/>
-        <w:widowControl/>
-        <w:spacing w:line="412" w:lineRule="exact" w:before="0" w:after="0"/>
-        <w:ind w:left="8" w:right="0" w:firstLine="0"/>
-        <w:jc w:val="left"/>
+        <w:jc w:val="center"/>
       </w:pPr>
       <w:r>
         <w:rPr>
-          <w:rFonts w:ascii="Helvetica" w:hAnsi="Helvetica" w:eastAsia="Helvetica"/>
-          <w:b w:val="0"/>
-          <w:i w:val="0"/>
-          <w:color w:val="000000"/>
-          <w:sz w:val="30"/>
+          <w:b/>
+          <w:sz w:val="28"/>
         </w:rPr>
         <w:t>PARROQUIA DE SAN JOSE - RESUMEN CONTABLE PARA TABLON</w:t>
       </w:r>
     </w:p>
     <w:p>
       <w:pPr>
-        <w:autoSpaceDN w:val="0"/>
-        <w:autoSpaceDE w:val="0"/>
-        <w:widowControl/>
-        <w:spacing w:line="248" w:lineRule="exact" w:before="148" w:after="0"/>
-        <w:ind w:left="8" w:right="0" w:firstLine="0"/>
-        <w:jc w:val="left"/>
+        <w:spacing w:after="160"/>
       </w:pPr>
       <w:r>
-        <w:rPr>
-          <w:rFonts w:ascii="Helvetica" w:hAnsi="Helvetica" w:eastAsia="Helvetica"/>
-          <w:b w:val="0"/>
-          <w:i w:val="0"/>
-          <w:color w:val="000000"/>
-          <w:sz w:val="18"/>
-        </w:rPr>
         <w:t>Periodo: enero 2026 | Documento de ejemplo para probar conversion PDF a Word</w:t>
       </w:r>
     </w:p>
     <w:p>
       <w:pPr>
-        <w:autoSpaceDN w:val="0"/>
-        <w:autoSpaceDE w:val="0"/>
-        <w:widowControl/>
-        <w:spacing w:line="266" w:lineRule="exact" w:before="534" w:after="532"/>
-        <w:ind w:left="8" w:right="1008" w:firstLine="0"/>
-        <w:jc w:val="left"/>
+        <w:spacing w:after="160"/>
       </w:pPr>
       <w:r>
-        <w:rPr>
-          <w:rFonts w:ascii="Helvetica" w:hAnsi="Helvetica" w:eastAsia="Helvetica"/>
-          <w:b w:val="0"/>
-          <w:i w:val="0"/>
-          <w:color w:val="000000"/>
-          <w:sz w:val="18"/>
-        </w:rPr>
-        <w:t xml:space="preserve">Este documento simula el tipo de PDF contable que se recibe desde un programa externo. El objetivo de la conversion es </w:t>
-      </w:r>
-      <w:r>
-        <w:rPr>
-          <w:rFonts w:ascii="Helvetica" w:hAnsi="Helvetica" w:eastAsia="Helvetica"/>
-          <w:b w:val="0"/>
-          <w:i w:val="0"/>
-          <w:color w:val="000000"/>
-          <w:sz w:val="18"/>
-        </w:rPr>
-        <w:t xml:space="preserve">poder abrirlo en Word, rectificar conceptos largos o poco claros, revisar importes y despues imprimirlo para exponerlo en el </w:t>
-      </w:r>
-      <w:r>
-        <w:rPr>
-          <w:rFonts w:ascii="Helvetica" w:hAnsi="Helvetica" w:eastAsia="Helvetica"/>
-          <w:b w:val="0"/>
-          <w:i w:val="0"/>
-          <w:color w:val="000000"/>
-          <w:sz w:val="18"/>
-        </w:rPr>
-        <w:t>tablon de anuncios.</w:t>
+        <w:t>Este documento simula el tipo de PDF contable que se recibe desde un programa externo. El objetivo de la conversion es poder abrirlo en Word, rectificar conceptos largos o poco claros, revisar importes y despues imprimirlo para exponerlo en el tablon de anuncios.</w:t>
       </w:r>
     </w:p>
     <w:tbl>
       <w:tblPr>
+        <w:tblStyle w:val="TableGrid"/>
         <w:tblW w:type="auto" w:w="0"/>
+        <w:jc w:val="center"/>
         <w:tblLayout w:type="fixed"/>
         <w:tblLook w:firstColumn="1" w:firstRow="1" w:lastColumn="0" w:lastRow="0" w:noHBand="0" w:noVBand="1" w:val="04A0"/>
-        <w:tblInd w:w="7.999999999999972" w:type="dxa"/>
       </w:tblPr>
       <w:tblGrid>
-        <w:gridCol w:w="2190"/>
-        <w:gridCol w:w="2190"/>
-        <w:gridCol w:w="2190"/>
-        <w:gridCol w:w="2190"/>
-        <w:gridCol w:w="2190"/>
+        <w:gridCol w:w="1008"/>
+        <w:gridCol w:w="3672"/>
+        <w:gridCol w:w="936"/>
+        <w:gridCol w:w="936"/>
+        <w:gridCol w:w="2880"/>
       </w:tblGrid>
       <w:tr>
         <w:trPr>
-          <w:trHeight w:hRule="exact" w:val="560"/>
+          <w:trHeight w:val="490" w:hRule="atLeast"/>
         </w:trPr>
         <w:tc>
           <w:tcPr>
-            <w:tcW w:type="dxa" w:w="1160"/>
-            <w:tcBorders>
-              <w:start w:sz="7.199999809265137" w:val="single" w:color="#595959"/>
-              <w:top w:sz="7.199999809265137" w:val="single" w:color="#595959"/>
-              <w:end w:sz="7.199999809265137" w:val="single" w:color="#595959"/>
-              <w:bottom w:sz="7.199999809265137" w:val="single" w:color="#595959"/>
-            </w:tcBorders>
-            <w:shd w:fill="e0e0e0"/>
-            <w:tcMar>
-              <w:start w:w="0" w:type="dxa"/>
-              <w:end w:w="0" w:type="dxa"/>
-            </w:tcMar>
+            <w:tcW w:type="dxa" w:w="1007"/>
+            <w:shd w:fill="E6E6E6"/>
           </w:tcPr>
           <w:p>
             <w:pPr>
-              <w:autoSpaceDN w:val="0"/>
-              <w:autoSpaceDE w:val="0"/>
-              <w:widowControl/>
-              <w:spacing w:line="220" w:lineRule="exact" w:before="72" w:after="0"/>
-              <w:ind w:left="72" w:right="0" w:firstLine="0"/>
-              <w:jc w:val="left"/>
+              <w:spacing w:after="0"/>
             </w:pPr>
             <w:r>
               <w:rPr>
-                <w:rFonts w:ascii="Helvetica" w:hAnsi="Helvetica" w:eastAsia="Helvetica"/>
-                <w:b w:val="0"/>
-                <w:i w:val="0"/>
-                <w:color w:val="000000"/>
+                <w:rFonts w:ascii="Arial" w:hAnsi="Arial"/>
+                <w:b/>
                 <w:sz w:val="16"/>
               </w:rPr>
               <w:t>Fecha</w:t>
@@ -147,34 +70,17 @@
         </w:tc>
         <w:tc>
           <w:tcPr>
-            <w:tcW w:type="dxa" w:w="4200"/>
-            <w:tcBorders>
-              <w:start w:sz="7.199999809265137" w:val="single" w:color="#595959"/>
-              <w:top w:sz="7.199999809265137" w:val="single" w:color="#595959"/>
-              <w:end w:sz="7.199999809265137" w:val="single" w:color="#595959"/>
-              <w:bottom w:sz="7.199999809265137" w:val="single" w:color="#595959"/>
-            </w:tcBorders>
-            <w:shd w:fill="e0e0e0"/>
-            <w:tcMar>
-              <w:start w:w="0" w:type="dxa"/>
-              <w:end w:w="0" w:type="dxa"/>
-            </w:tcMar>
+            <w:tcW w:type="dxa" w:w="3671"/>
+            <w:shd w:fill="E6E6E6"/>
           </w:tcPr>
           <w:p>
             <w:pPr>
-              <w:autoSpaceDN w:val="0"/>
-              <w:autoSpaceDE w:val="0"/>
-              <w:widowControl/>
-              <w:spacing w:line="220" w:lineRule="exact" w:before="72" w:after="0"/>
-              <w:ind w:left="72" w:right="0" w:firstLine="0"/>
-              <w:jc w:val="left"/>
+              <w:spacing w:after="0"/>
             </w:pPr>
             <w:r>
               <w:rPr>
-                <w:rFonts w:ascii="Helvetica" w:hAnsi="Helvetica" w:eastAsia="Helvetica"/>
-                <w:b w:val="0"/>
-                <w:i w:val="0"/>
-                <w:color w:val="000000"/>
+                <w:rFonts w:ascii="Arial" w:hAnsi="Arial"/>
+                <w:b/>
                 <w:sz w:val="16"/>
               </w:rPr>
               <w:t>Concepto generado por el programa</w:t>
@@ -183,34 +89,17 @@
         </w:tc>
         <w:tc>
           <w:tcPr>
-            <w:tcW w:type="dxa" w:w="1240"/>
-            <w:tcBorders>
-              <w:start w:sz="7.199999809265137" w:val="single" w:color="#595959"/>
-              <w:top w:sz="7.199999809265137" w:val="single" w:color="#595959"/>
-              <w:end w:sz="7.199999809265137" w:val="single" w:color="#595959"/>
-              <w:bottom w:sz="7.199999809265137" w:val="single" w:color="#595959"/>
-            </w:tcBorders>
-            <w:shd w:fill="e0e0e0"/>
-            <w:tcMar>
-              <w:start w:w="0" w:type="dxa"/>
-              <w:end w:w="0" w:type="dxa"/>
-            </w:tcMar>
+            <w:tcW w:type="dxa" w:w="936"/>
+            <w:shd w:fill="E6E6E6"/>
           </w:tcPr>
           <w:p>
             <w:pPr>
-              <w:autoSpaceDN w:val="0"/>
-              <w:autoSpaceDE w:val="0"/>
-              <w:widowControl/>
-              <w:spacing w:line="220" w:lineRule="exact" w:before="72" w:after="0"/>
-              <w:ind w:left="72" w:right="0" w:firstLine="0"/>
-              <w:jc w:val="left"/>
+              <w:spacing w:after="0"/>
             </w:pPr>
             <w:r>
               <w:rPr>
-                <w:rFonts w:ascii="Helvetica" w:hAnsi="Helvetica" w:eastAsia="Helvetica"/>
-                <w:b w:val="0"/>
-                <w:i w:val="0"/>
-                <w:color w:val="000000"/>
+                <w:rFonts w:ascii="Arial" w:hAnsi="Arial"/>
+                <w:b/>
                 <w:sz w:val="16"/>
               </w:rPr>
               <w:t>Debe</w:t>
@@ -219,34 +108,17 @@
         </w:tc>
         <w:tc>
           <w:tcPr>
-            <w:tcW w:type="dxa" w:w="1240"/>
-            <w:tcBorders>
-              <w:start w:sz="7.199999809265137" w:val="single" w:color="#595959"/>
-              <w:top w:sz="7.199999809265137" w:val="single" w:color="#595959"/>
-              <w:end w:sz="7.199999809265137" w:val="single" w:color="#595959"/>
-              <w:bottom w:sz="7.199999809265137" w:val="single" w:color="#595959"/>
-            </w:tcBorders>
-            <w:shd w:fill="e0e0e0"/>
-            <w:tcMar>
-              <w:start w:w="0" w:type="dxa"/>
-              <w:end w:w="0" w:type="dxa"/>
-            </w:tcMar>
+            <w:tcW w:type="dxa" w:w="936"/>
+            <w:shd w:fill="E6E6E6"/>
           </w:tcPr>
           <w:p>
             <w:pPr>
-              <w:autoSpaceDN w:val="0"/>
-              <w:autoSpaceDE w:val="0"/>
-              <w:widowControl/>
-              <w:spacing w:line="220" w:lineRule="exact" w:before="72" w:after="0"/>
-              <w:ind w:left="72" w:right="0" w:firstLine="0"/>
-              <w:jc w:val="left"/>
+              <w:spacing w:after="0"/>
             </w:pPr>
             <w:r>
               <w:rPr>
-                <w:rFonts w:ascii="Helvetica" w:hAnsi="Helvetica" w:eastAsia="Helvetica"/>
-                <w:b w:val="0"/>
-                <w:i w:val="0"/>
-                <w:color w:val="000000"/>
+                <w:rFonts w:ascii="Arial" w:hAnsi="Arial"/>
+                <w:b/>
                 <w:sz w:val="16"/>
               </w:rPr>
               <w:t>Haber</w:t>
@@ -255,34 +127,17 @@
         </w:tc>
         <w:tc>
           <w:tcPr>
-            <w:tcW w:type="dxa" w:w="3096"/>
-            <w:tcBorders>
-              <w:start w:sz="7.199999809265137" w:val="single" w:color="#595959"/>
-              <w:top w:sz="7.199999809265137" w:val="single" w:color="#595959"/>
-              <w:end w:sz="7.199999809265137" w:val="single" w:color="#595959"/>
-              <w:bottom w:sz="7.199999809265137" w:val="single" w:color="#595959"/>
-            </w:tcBorders>
-            <w:shd w:fill="e0e0e0"/>
-            <w:tcMar>
-              <w:start w:w="0" w:type="dxa"/>
-              <w:end w:w="0" w:type="dxa"/>
-            </w:tcMar>
+            <w:tcW w:type="dxa" w:w="2880"/>
+            <w:shd w:fill="E6E6E6"/>
           </w:tcPr>
           <w:p>
             <w:pPr>
-              <w:autoSpaceDN w:val="0"/>
-              <w:autoSpaceDE w:val="0"/>
-              <w:widowControl/>
-              <w:spacing w:line="220" w:lineRule="exact" w:before="72" w:after="0"/>
-              <w:ind w:left="72" w:right="0" w:firstLine="0"/>
-              <w:jc w:val="left"/>
+              <w:spacing w:after="0"/>
             </w:pPr>
             <w:r>
               <w:rPr>
-                <w:rFonts w:ascii="Helvetica" w:hAnsi="Helvetica" w:eastAsia="Helvetica"/>
-                <w:b w:val="0"/>
-                <w:i w:val="0"/>
-                <w:color w:val="000000"/>
+                <w:rFonts w:ascii="Arial" w:hAnsi="Arial"/>
+                <w:b/>
                 <w:sz w:val="16"/>
               </w:rPr>
               <w:t>Concepto rectificado</w:t>
@@ -292,39 +147,20 @@
       </w:tr>
       <w:tr>
         <w:trPr>
-          <w:trHeight w:hRule="exact" w:val="1040"/>
+          <w:trHeight w:val="893" w:hRule="atLeast"/>
         </w:trPr>
         <w:tc>
           <w:tcPr>
-            <w:tcW w:type="dxa" w:w="1160"/>
-            <w:tcBorders>
-              <w:start w:sz="7.199999809265137" w:val="single" w:color="#595959"/>
-              <w:top w:sz="7.199999809265137" w:val="single" w:color="#595959"/>
-              <w:end w:sz="7.199999809265137" w:val="single" w:color="#595959"/>
-              <w:bottom w:sz="7.199999809265137" w:val="single" w:color="#595959"/>
-            </w:tcBorders>
-            <w:tcMar>
-              <w:start w:w="0" w:type="dxa"/>
-              <w:end w:w="0" w:type="dxa"/>
-            </w:tcMar>
+            <w:tcW w:type="dxa" w:w="1007"/>
           </w:tcPr>
           <w:p>
             <w:pPr>
-              <w:autoSpaceDN w:val="0"/>
-              <w:autoSpaceDE w:val="0"/>
-              <w:widowControl/>
-              <w:spacing w:line="200" w:lineRule="exact" w:before="72" w:after="0"/>
-              <w:ind w:left="72" w:right="0" w:firstLine="0"/>
-              <w:jc w:val="left"/>
+              <w:spacing w:after="0"/>
             </w:pPr>
             <w:r>
               <w:rPr>
-                <w:w w:val="97.33333587646484"/>
-                <w:rFonts w:ascii="Helvetica" w:hAnsi="Helvetica" w:eastAsia="Helvetica"/>
-                <w:b w:val="0"/>
-                <w:i w:val="0"/>
-                <w:color w:val="000000"/>
-                <w:sz w:val="15"/>
+                <w:rFonts w:ascii="Arial" w:hAnsi="Arial"/>
+                <w:sz w:val="16"/>
               </w:rPr>
               <w:t>03/01/26</w:t>
             </w:r>
@@ -332,82 +168,33 @@
         </w:tc>
         <w:tc>
           <w:tcPr>
-            <w:tcW w:type="dxa" w:w="4200"/>
-            <w:tcBorders>
-              <w:start w:sz="7.199999809265137" w:val="single" w:color="#595959"/>
-              <w:top w:sz="7.199999809265137" w:val="single" w:color="#595959"/>
-              <w:end w:sz="7.199999809265137" w:val="single" w:color="#595959"/>
-              <w:bottom w:sz="7.199999809265137" w:val="single" w:color="#595959"/>
-            </w:tcBorders>
-            <w:tcMar>
-              <w:start w:w="0" w:type="dxa"/>
-              <w:end w:w="0" w:type="dxa"/>
-            </w:tcMar>
+            <w:tcW w:type="dxa" w:w="3671"/>
           </w:tcPr>
           <w:p>
             <w:pPr>
-              <w:autoSpaceDN w:val="0"/>
-              <w:autoSpaceDE w:val="0"/>
-              <w:widowControl/>
-              <w:spacing w:line="216" w:lineRule="exact" w:before="56" w:after="0"/>
-              <w:ind w:left="72" w:right="0" w:firstLine="0"/>
-              <w:jc w:val="left"/>
+              <w:spacing w:after="0"/>
             </w:pPr>
             <w:r>
               <w:rPr>
-                <w:w w:val="97.33333587646484"/>
-                <w:rFonts w:ascii="Helvetica" w:hAnsi="Helvetica" w:eastAsia="Helvetica"/>
-                <w:b w:val="0"/>
-                <w:i w:val="0"/>
-                <w:color w:val="000000"/>
-                <w:sz w:val="15"/>
+                <w:rFonts w:ascii="Arial" w:hAnsi="Arial"/>
+                <w:sz w:val="16"/>
               </w:rPr>
-              <w:t xml:space="preserve">APUNTE AUTOMATICO 000431 - SERVICIOS GENERALES </w:t>
-            </w:r>
-            <w:r>
-              <w:rPr>
-                <w:w w:val="97.33333587646484"/>
-                <w:rFonts w:ascii="Helvetica" w:hAnsi="Helvetica" w:eastAsia="Helvetica"/>
-                <w:b w:val="0"/>
-                <w:i w:val="0"/>
-                <w:color w:val="000000"/>
-                <w:sz w:val="15"/>
-              </w:rPr>
-              <w:t>DIVERSOS NO CLASIFICADOS PARROQUIA DIECISEIS</w:t>
+              <w:t>APUNTE AUTOMATICO 000431 - SERVICIOS GENERALES DIVERSOS NO CLASIFICADOS PARROQUIA DIECISEIS</w:t>
             </w:r>
           </w:p>
         </w:tc>
         <w:tc>
           <w:tcPr>
-            <w:tcW w:type="dxa" w:w="1240"/>
-            <w:tcBorders>
-              <w:start w:sz="7.199999809265137" w:val="single" w:color="#595959"/>
-              <w:top w:sz="7.199999809265137" w:val="single" w:color="#595959"/>
-              <w:end w:sz="7.199999809265137" w:val="single" w:color="#595959"/>
-              <w:bottom w:sz="7.199999809265137" w:val="single" w:color="#595959"/>
-            </w:tcBorders>
-            <w:tcMar>
-              <w:start w:w="0" w:type="dxa"/>
-              <w:end w:w="0" w:type="dxa"/>
-            </w:tcMar>
+            <w:tcW w:type="dxa" w:w="936"/>
           </w:tcPr>
           <w:p>
             <w:pPr>
-              <w:autoSpaceDN w:val="0"/>
-              <w:autoSpaceDE w:val="0"/>
-              <w:widowControl/>
-              <w:spacing w:line="200" w:lineRule="exact" w:before="72" w:after="0"/>
-              <w:ind w:left="72" w:right="0" w:firstLine="0"/>
-              <w:jc w:val="left"/>
+              <w:spacing w:after="0"/>
             </w:pPr>
             <w:r>
               <w:rPr>
-                <w:w w:val="97.33333587646484"/>
-                <w:rFonts w:ascii="Helvetica" w:hAnsi="Helvetica" w:eastAsia="Helvetica"/>
-                <w:b w:val="0"/>
-                <w:i w:val="0"/>
-                <w:color w:val="000000"/>
-                <w:sz w:val="15"/>
+                <w:rFonts w:ascii="Arial" w:hAnsi="Arial"/>
+                <w:sz w:val="16"/>
               </w:rPr>
               <w:t>0,00</w:t>
             </w:r>
@@ -415,35 +202,16 @@
         </w:tc>
         <w:tc>
           <w:tcPr>
-            <w:tcW w:type="dxa" w:w="1240"/>
-            <w:tcBorders>
-              <w:start w:sz="7.199999809265137" w:val="single" w:color="#595959"/>
-              <w:top w:sz="7.199999809265137" w:val="single" w:color="#595959"/>
-              <w:end w:sz="7.199999809265137" w:val="single" w:color="#595959"/>
-              <w:bottom w:sz="7.199999809265137" w:val="single" w:color="#595959"/>
-            </w:tcBorders>
-            <w:tcMar>
-              <w:start w:w="0" w:type="dxa"/>
-              <w:end w:w="0" w:type="dxa"/>
-            </w:tcMar>
+            <w:tcW w:type="dxa" w:w="936"/>
           </w:tcPr>
           <w:p>
             <w:pPr>
-              <w:autoSpaceDN w:val="0"/>
-              <w:autoSpaceDE w:val="0"/>
-              <w:widowControl/>
-              <w:spacing w:line="200" w:lineRule="exact" w:before="72" w:after="0"/>
-              <w:ind w:left="72" w:right="0" w:firstLine="0"/>
-              <w:jc w:val="left"/>
+              <w:spacing w:after="0"/>
             </w:pPr>
             <w:r>
               <w:rPr>
-                <w:w w:val="97.33333587646484"/>
-                <w:rFonts w:ascii="Helvetica" w:hAnsi="Helvetica" w:eastAsia="Helvetica"/>
-                <w:b w:val="0"/>
-                <w:i w:val="0"/>
-                <w:color w:val="000000"/>
-                <w:sz w:val="15"/>
+                <w:rFonts w:ascii="Arial" w:hAnsi="Arial"/>
+                <w:sz w:val="16"/>
               </w:rPr>
               <w:t>124,50</w:t>
             </w:r>
@@ -451,35 +219,16 @@
         </w:tc>
         <w:tc>
           <w:tcPr>
-            <w:tcW w:type="dxa" w:w="3096"/>
-            <w:tcBorders>
-              <w:start w:sz="7.199999809265137" w:val="single" w:color="#595959"/>
-              <w:top w:sz="7.199999809265137" w:val="single" w:color="#595959"/>
-              <w:end w:sz="7.199999809265137" w:val="single" w:color="#595959"/>
-              <w:bottom w:sz="7.199999809265137" w:val="single" w:color="#595959"/>
-            </w:tcBorders>
-            <w:tcMar>
-              <w:start w:w="0" w:type="dxa"/>
-              <w:end w:w="0" w:type="dxa"/>
-            </w:tcMar>
+            <w:tcW w:type="dxa" w:w="2880"/>
           </w:tcPr>
           <w:p>
             <w:pPr>
-              <w:autoSpaceDN w:val="0"/>
-              <w:autoSpaceDE w:val="0"/>
-              <w:widowControl/>
-              <w:spacing w:line="200" w:lineRule="exact" w:before="72" w:after="0"/>
-              <w:ind w:left="72" w:right="0" w:firstLine="0"/>
-              <w:jc w:val="left"/>
+              <w:spacing w:after="0"/>
             </w:pPr>
             <w:r>
               <w:rPr>
-                <w:w w:val="97.33333587646484"/>
-                <w:rFonts w:ascii="Helvetica" w:hAnsi="Helvetica" w:eastAsia="Helvetica"/>
-                <w:b w:val="0"/>
-                <w:i w:val="0"/>
-                <w:color w:val="000000"/>
-                <w:sz w:val="15"/>
+                <w:rFonts w:ascii="Arial" w:hAnsi="Arial"/>
+                <w:sz w:val="16"/>
               </w:rPr>
               <w:t>Donativos colecta primer domingo</w:t>
             </w:r>
@@ -488,39 +237,20 @@
       </w:tr>
       <w:tr>
         <w:trPr>
-          <w:trHeight w:hRule="exact" w:val="1040"/>
+          <w:trHeight w:val="893" w:hRule="atLeast"/>
         </w:trPr>
         <w:tc>
           <w:tcPr>
-            <w:tcW w:type="dxa" w:w="1160"/>
-            <w:tcBorders>
-              <w:start w:sz="7.199999809265137" w:val="single" w:color="#595959"/>
-              <w:top w:sz="7.199999809265137" w:val="single" w:color="#595959"/>
-              <w:end w:sz="7.199999809265137" w:val="single" w:color="#595959"/>
-              <w:bottom w:sz="7.199999809265137" w:val="single" w:color="#595959"/>
-            </w:tcBorders>
-            <w:tcMar>
-              <w:start w:w="0" w:type="dxa"/>
-              <w:end w:w="0" w:type="dxa"/>
-            </w:tcMar>
+            <w:tcW w:type="dxa" w:w="1007"/>
           </w:tcPr>
           <w:p>
             <w:pPr>
-              <w:autoSpaceDN w:val="0"/>
-              <w:autoSpaceDE w:val="0"/>
-              <w:widowControl/>
-              <w:spacing w:line="200" w:lineRule="exact" w:before="72" w:after="0"/>
-              <w:ind w:left="72" w:right="0" w:firstLine="0"/>
-              <w:jc w:val="left"/>
+              <w:spacing w:after="0"/>
             </w:pPr>
             <w:r>
               <w:rPr>
-                <w:w w:val="97.33333587646484"/>
-                <w:rFonts w:ascii="Helvetica" w:hAnsi="Helvetica" w:eastAsia="Helvetica"/>
-                <w:b w:val="0"/>
-                <w:i w:val="0"/>
-                <w:color w:val="000000"/>
-                <w:sz w:val="15"/>
+                <w:rFonts w:ascii="Arial" w:hAnsi="Arial"/>
+                <w:sz w:val="16"/>
               </w:rPr>
               <w:t>07/01/26</w:t>
             </w:r>
@@ -528,82 +258,33 @@
         </w:tc>
         <w:tc>
           <w:tcPr>
-            <w:tcW w:type="dxa" w:w="4200"/>
-            <w:tcBorders>
-              <w:start w:sz="7.199999809265137" w:val="single" w:color="#595959"/>
-              <w:top w:sz="7.199999809265137" w:val="single" w:color="#595959"/>
-              <w:end w:sz="7.199999809265137" w:val="single" w:color="#595959"/>
-              <w:bottom w:sz="7.199999809265137" w:val="single" w:color="#595959"/>
-            </w:tcBorders>
-            <w:tcMar>
-              <w:start w:w="0" w:type="dxa"/>
-              <w:end w:w="0" w:type="dxa"/>
-            </w:tcMar>
+            <w:tcW w:type="dxa" w:w="3671"/>
           </w:tcPr>
           <w:p>
             <w:pPr>
-              <w:autoSpaceDN w:val="0"/>
-              <w:autoSpaceDE w:val="0"/>
-              <w:widowControl/>
-              <w:spacing w:line="216" w:lineRule="exact" w:before="56" w:after="0"/>
-              <w:ind w:left="72" w:right="144" w:firstLine="0"/>
-              <w:jc w:val="left"/>
+              <w:spacing w:after="0"/>
             </w:pPr>
             <w:r>
               <w:rPr>
-                <w:w w:val="97.33333587646484"/>
-                <w:rFonts w:ascii="Helvetica" w:hAnsi="Helvetica" w:eastAsia="Helvetica"/>
-                <w:b w:val="0"/>
-                <w:i w:val="0"/>
-                <w:color w:val="000000"/>
-                <w:sz w:val="15"/>
+                <w:rFonts w:ascii="Arial" w:hAnsi="Arial"/>
+                <w:sz w:val="16"/>
               </w:rPr>
-              <w:t xml:space="preserve">CARGO BANCARIO SUMINISTRO ELECTRICO RECINTO </w:t>
-            </w:r>
-            <w:r>
-              <w:rPr>
-                <w:w w:val="97.33333587646484"/>
-                <w:rFonts w:ascii="Helvetica" w:hAnsi="Helvetica" w:eastAsia="Helvetica"/>
-                <w:b w:val="0"/>
-                <w:i w:val="0"/>
-                <w:color w:val="000000"/>
-                <w:sz w:val="15"/>
-              </w:rPr>
-              <w:t>ANEXO Y DEPENDENCIAS AUXILIARES</w:t>
+              <w:t>CARGO BANCARIO SUMINISTRO ELECTRICO RECINTO ANEXO Y DEPENDENCIAS AUXILIARES</w:t>
             </w:r>
           </w:p>
         </w:tc>
         <w:tc>
           <w:tcPr>
-            <w:tcW w:type="dxa" w:w="1240"/>
-            <w:tcBorders>
-              <w:start w:sz="7.199999809265137" w:val="single" w:color="#595959"/>
-              <w:top w:sz="7.199999809265137" w:val="single" w:color="#595959"/>
-              <w:end w:sz="7.199999809265137" w:val="single" w:color="#595959"/>
-              <w:bottom w:sz="7.199999809265137" w:val="single" w:color="#595959"/>
-            </w:tcBorders>
-            <w:tcMar>
-              <w:start w:w="0" w:type="dxa"/>
-              <w:end w:w="0" w:type="dxa"/>
-            </w:tcMar>
+            <w:tcW w:type="dxa" w:w="936"/>
           </w:tcPr>
           <w:p>
             <w:pPr>
-              <w:autoSpaceDN w:val="0"/>
-              <w:autoSpaceDE w:val="0"/>
-              <w:widowControl/>
-              <w:spacing w:line="200" w:lineRule="exact" w:before="72" w:after="0"/>
-              <w:ind w:left="72" w:right="0" w:firstLine="0"/>
-              <w:jc w:val="left"/>
+              <w:spacing w:after="0"/>
             </w:pPr>
             <w:r>
               <w:rPr>
-                <w:w w:val="97.33333587646484"/>
-                <w:rFonts w:ascii="Helvetica" w:hAnsi="Helvetica" w:eastAsia="Helvetica"/>
-                <w:b w:val="0"/>
-                <w:i w:val="0"/>
-                <w:color w:val="000000"/>
-                <w:sz w:val="15"/>
+                <w:rFonts w:ascii="Arial" w:hAnsi="Arial"/>
+                <w:sz w:val="16"/>
               </w:rPr>
               <w:t>86,42</w:t>
             </w:r>
@@ -611,35 +292,16 @@
         </w:tc>
         <w:tc>
           <w:tcPr>
-            <w:tcW w:type="dxa" w:w="1240"/>
-            <w:tcBorders>
-              <w:start w:sz="7.199999809265137" w:val="single" w:color="#595959"/>
-              <w:top w:sz="7.199999809265137" w:val="single" w:color="#595959"/>
-              <w:end w:sz="7.199999809265137" w:val="single" w:color="#595959"/>
-              <w:bottom w:sz="7.199999809265137" w:val="single" w:color="#595959"/>
-            </w:tcBorders>
-            <w:tcMar>
-              <w:start w:w="0" w:type="dxa"/>
-              <w:end w:w="0" w:type="dxa"/>
-            </w:tcMar>
+            <w:tcW w:type="dxa" w:w="936"/>
           </w:tcPr>
           <w:p>
             <w:pPr>
-              <w:autoSpaceDN w:val="0"/>
-              <w:autoSpaceDE w:val="0"/>
-              <w:widowControl/>
-              <w:spacing w:line="200" w:lineRule="exact" w:before="72" w:after="0"/>
-              <w:ind w:left="72" w:right="0" w:firstLine="0"/>
-              <w:jc w:val="left"/>
+              <w:spacing w:after="0"/>
             </w:pPr>
             <w:r>
               <w:rPr>
-                <w:w w:val="97.33333587646484"/>
-                <w:rFonts w:ascii="Helvetica" w:hAnsi="Helvetica" w:eastAsia="Helvetica"/>
-                <w:b w:val="0"/>
-                <w:i w:val="0"/>
-                <w:color w:val="000000"/>
-                <w:sz w:val="15"/>
+                <w:rFonts w:ascii="Arial" w:hAnsi="Arial"/>
+                <w:sz w:val="16"/>
               </w:rPr>
               <w:t>0,00</w:t>
             </w:r>
@@ -647,35 +309,16 @@
         </w:tc>
         <w:tc>
           <w:tcPr>
-            <w:tcW w:type="dxa" w:w="3096"/>
-            <w:tcBorders>
-              <w:start w:sz="7.199999809265137" w:val="single" w:color="#595959"/>
-              <w:top w:sz="7.199999809265137" w:val="single" w:color="#595959"/>
-              <w:end w:sz="7.199999809265137" w:val="single" w:color="#595959"/>
-              <w:bottom w:sz="7.199999809265137" w:val="single" w:color="#595959"/>
-            </w:tcBorders>
-            <w:tcMar>
-              <w:start w:w="0" w:type="dxa"/>
-              <w:end w:w="0" w:type="dxa"/>
-            </w:tcMar>
+            <w:tcW w:type="dxa" w:w="2880"/>
           </w:tcPr>
           <w:p>
             <w:pPr>
-              <w:autoSpaceDN w:val="0"/>
-              <w:autoSpaceDE w:val="0"/>
-              <w:widowControl/>
-              <w:spacing w:line="200" w:lineRule="exact" w:before="72" w:after="0"/>
-              <w:ind w:left="72" w:right="0" w:firstLine="0"/>
-              <w:jc w:val="left"/>
+              <w:spacing w:after="0"/>
             </w:pPr>
             <w:r>
               <w:rPr>
-                <w:w w:val="97.33333587646484"/>
-                <w:rFonts w:ascii="Helvetica" w:hAnsi="Helvetica" w:eastAsia="Helvetica"/>
-                <w:b w:val="0"/>
-                <w:i w:val="0"/>
-                <w:color w:val="000000"/>
-                <w:sz w:val="15"/>
+                <w:rFonts w:ascii="Arial" w:hAnsi="Arial"/>
+                <w:sz w:val="16"/>
               </w:rPr>
               <w:t>Factura electricidad parroquia</w:t>
             </w:r>
@@ -684,39 +327,20 @@
       </w:tr>
       <w:tr>
         <w:trPr>
-          <w:trHeight w:hRule="exact" w:val="1040"/>
+          <w:trHeight w:val="893" w:hRule="atLeast"/>
         </w:trPr>
         <w:tc>
           <w:tcPr>
-            <w:tcW w:type="dxa" w:w="1160"/>
-            <w:tcBorders>
-              <w:start w:sz="7.199999809265137" w:val="single" w:color="#595959"/>
-              <w:top w:sz="7.199999809265137" w:val="single" w:color="#595959"/>
-              <w:end w:sz="7.199999809265137" w:val="single" w:color="#595959"/>
-              <w:bottom w:sz="7.199999809265137" w:val="single" w:color="#595959"/>
-            </w:tcBorders>
-            <w:tcMar>
-              <w:start w:w="0" w:type="dxa"/>
-              <w:end w:w="0" w:type="dxa"/>
-            </w:tcMar>
+            <w:tcW w:type="dxa" w:w="1007"/>
           </w:tcPr>
           <w:p>
             <w:pPr>
-              <w:autoSpaceDN w:val="0"/>
-              <w:autoSpaceDE w:val="0"/>
-              <w:widowControl/>
-              <w:spacing w:line="200" w:lineRule="exact" w:before="72" w:after="0"/>
-              <w:ind w:left="72" w:right="0" w:firstLine="0"/>
-              <w:jc w:val="left"/>
+              <w:spacing w:after="0"/>
             </w:pPr>
             <w:r>
               <w:rPr>
-                <w:w w:val="97.33333587646484"/>
-                <w:rFonts w:ascii="Helvetica" w:hAnsi="Helvetica" w:eastAsia="Helvetica"/>
-                <w:b w:val="0"/>
-                <w:i w:val="0"/>
-                <w:color w:val="000000"/>
-                <w:sz w:val="15"/>
+                <w:rFonts w:ascii="Arial" w:hAnsi="Arial"/>
+                <w:sz w:val="16"/>
               </w:rPr>
               <w:t>12/01/26</w:t>
             </w:r>
@@ -724,82 +348,33 @@
         </w:tc>
         <w:tc>
           <w:tcPr>
-            <w:tcW w:type="dxa" w:w="4200"/>
-            <w:tcBorders>
-              <w:start w:sz="7.199999809265137" w:val="single" w:color="#595959"/>
-              <w:top w:sz="7.199999809265137" w:val="single" w:color="#595959"/>
-              <w:end w:sz="7.199999809265137" w:val="single" w:color="#595959"/>
-              <w:bottom w:sz="7.199999809265137" w:val="single" w:color="#595959"/>
-            </w:tcBorders>
-            <w:tcMar>
-              <w:start w:w="0" w:type="dxa"/>
-              <w:end w:w="0" w:type="dxa"/>
-            </w:tcMar>
+            <w:tcW w:type="dxa" w:w="3671"/>
           </w:tcPr>
           <w:p>
             <w:pPr>
-              <w:autoSpaceDN w:val="0"/>
-              <w:autoSpaceDE w:val="0"/>
-              <w:widowControl/>
-              <w:spacing w:line="216" w:lineRule="exact" w:before="56" w:after="0"/>
-              <w:ind w:left="72" w:right="288" w:firstLine="0"/>
-              <w:jc w:val="left"/>
+              <w:spacing w:after="0"/>
             </w:pPr>
             <w:r>
               <w:rPr>
-                <w:w w:val="97.33333587646484"/>
-                <w:rFonts w:ascii="Helvetica" w:hAnsi="Helvetica" w:eastAsia="Helvetica"/>
-                <w:b w:val="0"/>
-                <w:i w:val="0"/>
-                <w:color w:val="000000"/>
-                <w:sz w:val="15"/>
+                <w:rFonts w:ascii="Arial" w:hAnsi="Arial"/>
+                <w:sz w:val="16"/>
               </w:rPr>
-              <w:t xml:space="preserve">LIQUIDACION MOVIMIENTOS EFECTIVO CAJA MENOR </w:t>
-            </w:r>
-            <w:r>
-              <w:rPr>
-                <w:w w:val="97.33333587646484"/>
-                <w:rFonts w:ascii="Helvetica" w:hAnsi="Helvetica" w:eastAsia="Helvetica"/>
-                <w:b w:val="0"/>
-                <w:i w:val="0"/>
-                <w:color w:val="000000"/>
-                <w:sz w:val="15"/>
-              </w:rPr>
-              <w:t>ACTIVIDAD ORDINARIA SIN DETALLE</w:t>
+              <w:t>LIQUIDACION MOVIMIENTOS EFECTIVO CAJA MENOR ACTIVIDAD ORDINARIA SIN DETALLE</w:t>
             </w:r>
           </w:p>
         </w:tc>
         <w:tc>
           <w:tcPr>
-            <w:tcW w:type="dxa" w:w="1240"/>
-            <w:tcBorders>
-              <w:start w:sz="7.199999809265137" w:val="single" w:color="#595959"/>
-              <w:top w:sz="7.199999809265137" w:val="single" w:color="#595959"/>
-              <w:end w:sz="7.199999809265137" w:val="single" w:color="#595959"/>
-              <w:bottom w:sz="7.199999809265137" w:val="single" w:color="#595959"/>
-            </w:tcBorders>
-            <w:tcMar>
-              <w:start w:w="0" w:type="dxa"/>
-              <w:end w:w="0" w:type="dxa"/>
-            </w:tcMar>
+            <w:tcW w:type="dxa" w:w="936"/>
           </w:tcPr>
           <w:p>
             <w:pPr>
-              <w:autoSpaceDN w:val="0"/>
-              <w:autoSpaceDE w:val="0"/>
-              <w:widowControl/>
-              <w:spacing w:line="200" w:lineRule="exact" w:before="72" w:after="0"/>
-              <w:ind w:left="72" w:right="0" w:firstLine="0"/>
-              <w:jc w:val="left"/>
+              <w:spacing w:after="0"/>
             </w:pPr>
             <w:r>
               <w:rPr>
-                <w:w w:val="97.33333587646484"/>
-                <w:rFonts w:ascii="Helvetica" w:hAnsi="Helvetica" w:eastAsia="Helvetica"/>
-                <w:b w:val="0"/>
-                <w:i w:val="0"/>
-                <w:color w:val="000000"/>
-                <w:sz w:val="15"/>
+                <w:rFonts w:ascii="Arial" w:hAnsi="Arial"/>
+                <w:sz w:val="16"/>
               </w:rPr>
               <w:t>32,10</w:t>
             </w:r>
@@ -807,35 +382,16 @@
         </w:tc>
         <w:tc>
           <w:tcPr>
-            <w:tcW w:type="dxa" w:w="1240"/>
-            <w:tcBorders>
-              <w:start w:sz="7.199999809265137" w:val="single" w:color="#595959"/>
-              <w:top w:sz="7.199999809265137" w:val="single" w:color="#595959"/>
-              <w:end w:sz="7.199999809265137" w:val="single" w:color="#595959"/>
-              <w:bottom w:sz="7.199999809265137" w:val="single" w:color="#595959"/>
-            </w:tcBorders>
-            <w:tcMar>
-              <w:start w:w="0" w:type="dxa"/>
-              <w:end w:w="0" w:type="dxa"/>
-            </w:tcMar>
+            <w:tcW w:type="dxa" w:w="936"/>
           </w:tcPr>
           <w:p>
             <w:pPr>
-              <w:autoSpaceDN w:val="0"/>
-              <w:autoSpaceDE w:val="0"/>
-              <w:widowControl/>
-              <w:spacing w:line="200" w:lineRule="exact" w:before="72" w:after="0"/>
-              <w:ind w:left="72" w:right="0" w:firstLine="0"/>
-              <w:jc w:val="left"/>
+              <w:spacing w:after="0"/>
             </w:pPr>
             <w:r>
               <w:rPr>
-                <w:w w:val="97.33333587646484"/>
-                <w:rFonts w:ascii="Helvetica" w:hAnsi="Helvetica" w:eastAsia="Helvetica"/>
-                <w:b w:val="0"/>
-                <w:i w:val="0"/>
-                <w:color w:val="000000"/>
-                <w:sz w:val="15"/>
+                <w:rFonts w:ascii="Arial" w:hAnsi="Arial"/>
+                <w:sz w:val="16"/>
               </w:rPr>
               <w:t>0,00</w:t>
             </w:r>
@@ -843,35 +399,16 @@
         </w:tc>
         <w:tc>
           <w:tcPr>
-            <w:tcW w:type="dxa" w:w="3096"/>
-            <w:tcBorders>
-              <w:start w:sz="7.199999809265137" w:val="single" w:color="#595959"/>
-              <w:top w:sz="7.199999809265137" w:val="single" w:color="#595959"/>
-              <w:end w:sz="7.199999809265137" w:val="single" w:color="#595959"/>
-              <w:bottom w:sz="7.199999809265137" w:val="single" w:color="#595959"/>
-            </w:tcBorders>
-            <w:tcMar>
-              <w:start w:w="0" w:type="dxa"/>
-              <w:end w:w="0" w:type="dxa"/>
-            </w:tcMar>
+            <w:tcW w:type="dxa" w:w="2880"/>
           </w:tcPr>
           <w:p>
             <w:pPr>
-              <w:autoSpaceDN w:val="0"/>
-              <w:autoSpaceDE w:val="0"/>
-              <w:widowControl/>
-              <w:spacing w:line="200" w:lineRule="exact" w:before="72" w:after="0"/>
-              <w:ind w:left="72" w:right="0" w:firstLine="0"/>
-              <w:jc w:val="left"/>
+              <w:spacing w:after="0"/>
             </w:pPr>
             <w:r>
               <w:rPr>
-                <w:w w:val="97.33333587646484"/>
-                <w:rFonts w:ascii="Helvetica" w:hAnsi="Helvetica" w:eastAsia="Helvetica"/>
-                <w:b w:val="0"/>
-                <w:i w:val="0"/>
-                <w:color w:val="000000"/>
-                <w:sz w:val="15"/>
+                <w:rFonts w:ascii="Arial" w:hAnsi="Arial"/>
+                <w:sz w:val="16"/>
               </w:rPr>
               <w:t>Material limpieza y oficina</w:t>
             </w:r>
@@ -880,39 +417,20 @@
       </w:tr>
       <w:tr>
         <w:trPr>
-          <w:trHeight w:hRule="exact" w:val="1040"/>
+          <w:trHeight w:val="893" w:hRule="atLeast"/>
         </w:trPr>
         <w:tc>
           <w:tcPr>
-            <w:tcW w:type="dxa" w:w="1160"/>
-            <w:tcBorders>
-              <w:start w:sz="7.199999809265137" w:val="single" w:color="#595959"/>
-              <w:top w:sz="7.199999809265137" w:val="single" w:color="#595959"/>
-              <w:end w:sz="7.199999809265137" w:val="single" w:color="#595959"/>
-              <w:bottom w:sz="7.199999809265137" w:val="single" w:color="#595959"/>
-            </w:tcBorders>
-            <w:tcMar>
-              <w:start w:w="0" w:type="dxa"/>
-              <w:end w:w="0" w:type="dxa"/>
-            </w:tcMar>
+            <w:tcW w:type="dxa" w:w="1007"/>
           </w:tcPr>
           <w:p>
             <w:pPr>
-              <w:autoSpaceDN w:val="0"/>
-              <w:autoSpaceDE w:val="0"/>
-              <w:widowControl/>
-              <w:spacing w:line="200" w:lineRule="exact" w:before="72" w:after="0"/>
-              <w:ind w:left="72" w:right="0" w:firstLine="0"/>
-              <w:jc w:val="left"/>
+              <w:spacing w:after="0"/>
             </w:pPr>
             <w:r>
               <w:rPr>
-                <w:w w:val="97.33333587646484"/>
-                <w:rFonts w:ascii="Helvetica" w:hAnsi="Helvetica" w:eastAsia="Helvetica"/>
-                <w:b w:val="0"/>
-                <w:i w:val="0"/>
-                <w:color w:val="000000"/>
-                <w:sz w:val="15"/>
+                <w:rFonts w:ascii="Arial" w:hAnsi="Arial"/>
+                <w:sz w:val="16"/>
               </w:rPr>
               <w:t>16/01/26</w:t>
             </w:r>
@@ -920,82 +438,33 @@
         </w:tc>
         <w:tc>
           <w:tcPr>
-            <w:tcW w:type="dxa" w:w="4200"/>
-            <w:tcBorders>
-              <w:start w:sz="7.199999809265137" w:val="single" w:color="#595959"/>
-              <w:top w:sz="7.199999809265137" w:val="single" w:color="#595959"/>
-              <w:end w:sz="7.199999809265137" w:val="single" w:color="#595959"/>
-              <w:bottom w:sz="7.199999809265137" w:val="single" w:color="#595959"/>
-            </w:tcBorders>
-            <w:tcMar>
-              <w:start w:w="0" w:type="dxa"/>
-              <w:end w:w="0" w:type="dxa"/>
-            </w:tcMar>
+            <w:tcW w:type="dxa" w:w="3671"/>
           </w:tcPr>
           <w:p>
             <w:pPr>
-              <w:autoSpaceDN w:val="0"/>
-              <w:autoSpaceDE w:val="0"/>
-              <w:widowControl/>
-              <w:spacing w:line="216" w:lineRule="exact" w:before="56" w:after="0"/>
-              <w:ind w:left="72" w:right="144" w:firstLine="0"/>
-              <w:jc w:val="left"/>
+              <w:spacing w:after="0"/>
             </w:pPr>
             <w:r>
               <w:rPr>
-                <w:w w:val="97.33333587646484"/>
-                <w:rFonts w:ascii="Helvetica" w:hAnsi="Helvetica" w:eastAsia="Helvetica"/>
-                <w:b w:val="0"/>
-                <w:i w:val="0"/>
-                <w:color w:val="000000"/>
-                <w:sz w:val="15"/>
+                <w:rFonts w:ascii="Arial" w:hAnsi="Arial"/>
+                <w:sz w:val="16"/>
               </w:rPr>
-              <w:t xml:space="preserve">INGRESO TRANSFERENCIA AGRUPADA CONCEPTO NO </w:t>
-            </w:r>
-            <w:r>
-              <w:rPr>
-                <w:w w:val="97.33333587646484"/>
-                <w:rFonts w:ascii="Helvetica" w:hAnsi="Helvetica" w:eastAsia="Helvetica"/>
-                <w:b w:val="0"/>
-                <w:i w:val="0"/>
-                <w:color w:val="000000"/>
-                <w:sz w:val="15"/>
-              </w:rPr>
-              <w:t>EDITABLE SEGUN PAQUETE CONTABILIDAD</w:t>
+              <w:t>INGRESO TRANSFERENCIA AGRUPADA CONCEPTO NO EDITABLE SEGUN PAQUETE CONTABILIDAD</w:t>
             </w:r>
           </w:p>
         </w:tc>
         <w:tc>
           <w:tcPr>
-            <w:tcW w:type="dxa" w:w="1240"/>
-            <w:tcBorders>
-              <w:start w:sz="7.199999809265137" w:val="single" w:color="#595959"/>
-              <w:top w:sz="7.199999809265137" w:val="single" w:color="#595959"/>
-              <w:end w:sz="7.199999809265137" w:val="single" w:color="#595959"/>
-              <w:bottom w:sz="7.199999809265137" w:val="single" w:color="#595959"/>
-            </w:tcBorders>
-            <w:tcMar>
-              <w:start w:w="0" w:type="dxa"/>
-              <w:end w:w="0" w:type="dxa"/>
-            </w:tcMar>
+            <w:tcW w:type="dxa" w:w="936"/>
           </w:tcPr>
           <w:p>
             <w:pPr>
-              <w:autoSpaceDN w:val="0"/>
-              <w:autoSpaceDE w:val="0"/>
-              <w:widowControl/>
-              <w:spacing w:line="200" w:lineRule="exact" w:before="72" w:after="0"/>
-              <w:ind w:left="72" w:right="0" w:firstLine="0"/>
-              <w:jc w:val="left"/>
+              <w:spacing w:after="0"/>
             </w:pPr>
             <w:r>
               <w:rPr>
-                <w:w w:val="97.33333587646484"/>
-                <w:rFonts w:ascii="Helvetica" w:hAnsi="Helvetica" w:eastAsia="Helvetica"/>
-                <w:b w:val="0"/>
-                <w:i w:val="0"/>
-                <w:color w:val="000000"/>
-                <w:sz w:val="15"/>
+                <w:rFonts w:ascii="Arial" w:hAnsi="Arial"/>
+                <w:sz w:val="16"/>
               </w:rPr>
               <w:t>0,00</w:t>
             </w:r>
@@ -1003,35 +472,16 @@
         </w:tc>
         <w:tc>
           <w:tcPr>
-            <w:tcW w:type="dxa" w:w="1240"/>
-            <w:tcBorders>
-              <w:start w:sz="7.199999809265137" w:val="single" w:color="#595959"/>
-              <w:top w:sz="7.199999809265137" w:val="single" w:color="#595959"/>
-              <w:end w:sz="7.199999809265137" w:val="single" w:color="#595959"/>
-              <w:bottom w:sz="7.199999809265137" w:val="single" w:color="#595959"/>
-            </w:tcBorders>
-            <w:tcMar>
-              <w:start w:w="0" w:type="dxa"/>
-              <w:end w:w="0" w:type="dxa"/>
-            </w:tcMar>
+            <w:tcW w:type="dxa" w:w="936"/>
           </w:tcPr>
           <w:p>
             <w:pPr>
-              <w:autoSpaceDN w:val="0"/>
-              <w:autoSpaceDE w:val="0"/>
-              <w:widowControl/>
-              <w:spacing w:line="200" w:lineRule="exact" w:before="72" w:after="0"/>
-              <w:ind w:left="72" w:right="0" w:firstLine="0"/>
-              <w:jc w:val="left"/>
+              <w:spacing w:after="0"/>
             </w:pPr>
             <w:r>
               <w:rPr>
-                <w:w w:val="97.33333587646484"/>
-                <w:rFonts w:ascii="Helvetica" w:hAnsi="Helvetica" w:eastAsia="Helvetica"/>
-                <w:b w:val="0"/>
-                <w:i w:val="0"/>
-                <w:color w:val="000000"/>
-                <w:sz w:val="15"/>
+                <w:rFonts w:ascii="Arial" w:hAnsi="Arial"/>
+                <w:sz w:val="16"/>
               </w:rPr>
               <w:t>210,00</w:t>
             </w:r>
@@ -1039,35 +489,16 @@
         </w:tc>
         <w:tc>
           <w:tcPr>
-            <w:tcW w:type="dxa" w:w="3096"/>
-            <w:tcBorders>
-              <w:start w:sz="7.199999809265137" w:val="single" w:color="#595959"/>
-              <w:top w:sz="7.199999809265137" w:val="single" w:color="#595959"/>
-              <w:end w:sz="7.199999809265137" w:val="single" w:color="#595959"/>
-              <w:bottom w:sz="7.199999809265137" w:val="single" w:color="#595959"/>
-            </w:tcBorders>
-            <w:tcMar>
-              <w:start w:w="0" w:type="dxa"/>
-              <w:end w:w="0" w:type="dxa"/>
-            </w:tcMar>
+            <w:tcW w:type="dxa" w:w="2880"/>
           </w:tcPr>
           <w:p>
             <w:pPr>
-              <w:autoSpaceDN w:val="0"/>
-              <w:autoSpaceDE w:val="0"/>
-              <w:widowControl/>
-              <w:spacing w:line="200" w:lineRule="exact" w:before="72" w:after="0"/>
-              <w:ind w:left="72" w:right="0" w:firstLine="0"/>
-              <w:jc w:val="left"/>
+              <w:spacing w:after="0"/>
             </w:pPr>
             <w:r>
               <w:rPr>
-                <w:w w:val="97.33333587646484"/>
-                <w:rFonts w:ascii="Helvetica" w:hAnsi="Helvetica" w:eastAsia="Helvetica"/>
-                <w:b w:val="0"/>
-                <w:i w:val="0"/>
-                <w:color w:val="000000"/>
-                <w:sz w:val="15"/>
+                <w:rFonts w:ascii="Arial" w:hAnsi="Arial"/>
+                <w:sz w:val="16"/>
               </w:rPr>
               <w:t>Aportaciones grupo catequesis</w:t>
             </w:r>
@@ -1076,39 +507,20 @@
       </w:tr>
       <w:tr>
         <w:trPr>
-          <w:trHeight w:hRule="exact" w:val="1040"/>
+          <w:trHeight w:val="893" w:hRule="atLeast"/>
         </w:trPr>
         <w:tc>
           <w:tcPr>
-            <w:tcW w:type="dxa" w:w="1160"/>
-            <w:tcBorders>
-              <w:start w:sz="7.199999809265137" w:val="single" w:color="#595959"/>
-              <w:top w:sz="7.199999809265137" w:val="single" w:color="#595959"/>
-              <w:end w:sz="7.199999809265137" w:val="single" w:color="#595959"/>
-              <w:bottom w:sz="7.199999809265137" w:val="single" w:color="#595959"/>
-            </w:tcBorders>
-            <w:tcMar>
-              <w:start w:w="0" w:type="dxa"/>
-              <w:end w:w="0" w:type="dxa"/>
-            </w:tcMar>
+            <w:tcW w:type="dxa" w:w="1007"/>
           </w:tcPr>
           <w:p>
             <w:pPr>
-              <w:autoSpaceDN w:val="0"/>
-              <w:autoSpaceDE w:val="0"/>
-              <w:widowControl/>
-              <w:spacing w:line="200" w:lineRule="exact" w:before="72" w:after="0"/>
-              <w:ind w:left="72" w:right="0" w:firstLine="0"/>
-              <w:jc w:val="left"/>
+              <w:spacing w:after="0"/>
             </w:pPr>
             <w:r>
               <w:rPr>
-                <w:w w:val="97.33333587646484"/>
-                <w:rFonts w:ascii="Helvetica" w:hAnsi="Helvetica" w:eastAsia="Helvetica"/>
-                <w:b w:val="0"/>
-                <w:i w:val="0"/>
-                <w:color w:val="000000"/>
-                <w:sz w:val="15"/>
+                <w:rFonts w:ascii="Arial" w:hAnsi="Arial"/>
+                <w:sz w:val="16"/>
               </w:rPr>
               <w:t>21/01/26</w:t>
             </w:r>
@@ -1116,82 +528,33 @@
         </w:tc>
         <w:tc>
           <w:tcPr>
-            <w:tcW w:type="dxa" w:w="4200"/>
-            <w:tcBorders>
-              <w:start w:sz="7.199999809265137" w:val="single" w:color="#595959"/>
-              <w:top w:sz="7.199999809265137" w:val="single" w:color="#595959"/>
-              <w:end w:sz="7.199999809265137" w:val="single" w:color="#595959"/>
-              <w:bottom w:sz="7.199999809265137" w:val="single" w:color="#595959"/>
-            </w:tcBorders>
-            <w:tcMar>
-              <w:start w:w="0" w:type="dxa"/>
-              <w:end w:w="0" w:type="dxa"/>
-            </w:tcMar>
+            <w:tcW w:type="dxa" w:w="3671"/>
           </w:tcPr>
           <w:p>
             <w:pPr>
-              <w:autoSpaceDN w:val="0"/>
-              <w:autoSpaceDE w:val="0"/>
-              <w:widowControl/>
-              <w:spacing w:line="216" w:lineRule="exact" w:before="56" w:after="0"/>
-              <w:ind w:left="72" w:right="0" w:firstLine="0"/>
-              <w:jc w:val="left"/>
+              <w:spacing w:after="0"/>
             </w:pPr>
             <w:r>
               <w:rPr>
-                <w:w w:val="97.33333587646484"/>
-                <w:rFonts w:ascii="Helvetica" w:hAnsi="Helvetica" w:eastAsia="Helvetica"/>
-                <w:b w:val="0"/>
-                <w:i w:val="0"/>
-                <w:color w:val="000000"/>
-                <w:sz w:val="15"/>
+                <w:rFonts w:ascii="Arial" w:hAnsi="Arial"/>
+                <w:sz w:val="16"/>
               </w:rPr>
-              <w:t xml:space="preserve">PAGO PROVEEDOR GENERICO MANTENIMIENTO LOCAL </w:t>
-            </w:r>
-            <w:r>
-              <w:rPr>
-                <w:w w:val="97.33333587646484"/>
-                <w:rFonts w:ascii="Helvetica" w:hAnsi="Helvetica" w:eastAsia="Helvetica"/>
-                <w:b w:val="0"/>
-                <w:i w:val="0"/>
-                <w:color w:val="000000"/>
-                <w:sz w:val="15"/>
-              </w:rPr>
-              <w:t>SOCIAL PARROQUIAL CODIGO INTERNO 78-A</w:t>
+              <w:t>PAGO PROVEEDOR GENERICO MANTENIMIENTO LOCAL SOCIAL PARROQUIAL CODIGO INTERNO 78-A</w:t>
             </w:r>
           </w:p>
         </w:tc>
         <w:tc>
           <w:tcPr>
-            <w:tcW w:type="dxa" w:w="1240"/>
-            <w:tcBorders>
-              <w:start w:sz="7.199999809265137" w:val="single" w:color="#595959"/>
-              <w:top w:sz="7.199999809265137" w:val="single" w:color="#595959"/>
-              <w:end w:sz="7.199999809265137" w:val="single" w:color="#595959"/>
-              <w:bottom w:sz="7.199999809265137" w:val="single" w:color="#595959"/>
-            </w:tcBorders>
-            <w:tcMar>
-              <w:start w:w="0" w:type="dxa"/>
-              <w:end w:w="0" w:type="dxa"/>
-            </w:tcMar>
+            <w:tcW w:type="dxa" w:w="936"/>
           </w:tcPr>
           <w:p>
             <w:pPr>
-              <w:autoSpaceDN w:val="0"/>
-              <w:autoSpaceDE w:val="0"/>
-              <w:widowControl/>
-              <w:spacing w:line="200" w:lineRule="exact" w:before="72" w:after="0"/>
-              <w:ind w:left="72" w:right="0" w:firstLine="0"/>
-              <w:jc w:val="left"/>
+              <w:spacing w:after="0"/>
             </w:pPr>
             <w:r>
               <w:rPr>
-                <w:w w:val="97.33333587646484"/>
-                <w:rFonts w:ascii="Helvetica" w:hAnsi="Helvetica" w:eastAsia="Helvetica"/>
-                <w:b w:val="0"/>
-                <w:i w:val="0"/>
-                <w:color w:val="000000"/>
-                <w:sz w:val="15"/>
+                <w:rFonts w:ascii="Arial" w:hAnsi="Arial"/>
+                <w:sz w:val="16"/>
               </w:rPr>
               <w:t>145,20</w:t>
             </w:r>
@@ -1199,35 +562,16 @@
         </w:tc>
         <w:tc>
           <w:tcPr>
-            <w:tcW w:type="dxa" w:w="1240"/>
-            <w:tcBorders>
-              <w:start w:sz="7.199999809265137" w:val="single" w:color="#595959"/>
-              <w:top w:sz="7.199999809265137" w:val="single" w:color="#595959"/>
-              <w:end w:sz="7.199999809265137" w:val="single" w:color="#595959"/>
-              <w:bottom w:sz="7.199999809265137" w:val="single" w:color="#595959"/>
-            </w:tcBorders>
-            <w:tcMar>
-              <w:start w:w="0" w:type="dxa"/>
-              <w:end w:w="0" w:type="dxa"/>
-            </w:tcMar>
+            <w:tcW w:type="dxa" w:w="936"/>
           </w:tcPr>
           <w:p>
             <w:pPr>
-              <w:autoSpaceDN w:val="0"/>
-              <w:autoSpaceDE w:val="0"/>
-              <w:widowControl/>
-              <w:spacing w:line="200" w:lineRule="exact" w:before="72" w:after="0"/>
-              <w:ind w:left="72" w:right="0" w:firstLine="0"/>
-              <w:jc w:val="left"/>
+              <w:spacing w:after="0"/>
             </w:pPr>
             <w:r>
               <w:rPr>
-                <w:w w:val="97.33333587646484"/>
-                <w:rFonts w:ascii="Helvetica" w:hAnsi="Helvetica" w:eastAsia="Helvetica"/>
-                <w:b w:val="0"/>
-                <w:i w:val="0"/>
-                <w:color w:val="000000"/>
-                <w:sz w:val="15"/>
+                <w:rFonts w:ascii="Arial" w:hAnsi="Arial"/>
+                <w:sz w:val="16"/>
               </w:rPr>
               <w:t>0,00</w:t>
             </w:r>
@@ -1235,35 +579,16 @@
         </w:tc>
         <w:tc>
           <w:tcPr>
-            <w:tcW w:type="dxa" w:w="3096"/>
-            <w:tcBorders>
-              <w:start w:sz="7.199999809265137" w:val="single" w:color="#595959"/>
-              <w:top w:sz="7.199999809265137" w:val="single" w:color="#595959"/>
-              <w:end w:sz="7.199999809265137" w:val="single" w:color="#595959"/>
-              <w:bottom w:sz="7.199999809265137" w:val="single" w:color="#595959"/>
-            </w:tcBorders>
-            <w:tcMar>
-              <w:start w:w="0" w:type="dxa"/>
-              <w:end w:w="0" w:type="dxa"/>
-            </w:tcMar>
+            <w:tcW w:type="dxa" w:w="2880"/>
           </w:tcPr>
           <w:p>
             <w:pPr>
-              <w:autoSpaceDN w:val="0"/>
-              <w:autoSpaceDE w:val="0"/>
-              <w:widowControl/>
-              <w:spacing w:line="200" w:lineRule="exact" w:before="72" w:after="0"/>
-              <w:ind w:left="72" w:right="0" w:firstLine="0"/>
-              <w:jc w:val="left"/>
+              <w:spacing w:after="0"/>
             </w:pPr>
             <w:r>
               <w:rPr>
-                <w:w w:val="97.33333587646484"/>
-                <w:rFonts w:ascii="Helvetica" w:hAnsi="Helvetica" w:eastAsia="Helvetica"/>
-                <w:b w:val="0"/>
-                <w:i w:val="0"/>
-                <w:color w:val="000000"/>
-                <w:sz w:val="15"/>
+                <w:rFonts w:ascii="Arial" w:hAnsi="Arial"/>
+                <w:sz w:val="16"/>
               </w:rPr>
               <w:t>Reparacion puerta salon parroquial</w:t>
             </w:r>
@@ -1272,39 +597,20 @@
       </w:tr>
       <w:tr>
         <w:trPr>
-          <w:trHeight w:hRule="exact" w:val="1040"/>
+          <w:trHeight w:val="893" w:hRule="atLeast"/>
         </w:trPr>
         <w:tc>
           <w:tcPr>
-            <w:tcW w:type="dxa" w:w="1160"/>
-            <w:tcBorders>
-              <w:start w:sz="7.199999809265137" w:val="single" w:color="#595959"/>
-              <w:top w:sz="7.199999809265137" w:val="single" w:color="#595959"/>
-              <w:end w:sz="7.199999809265137" w:val="single" w:color="#595959"/>
-              <w:bottom w:sz="7.199999809265137" w:val="single" w:color="#595959"/>
-            </w:tcBorders>
-            <w:tcMar>
-              <w:start w:w="0" w:type="dxa"/>
-              <w:end w:w="0" w:type="dxa"/>
-            </w:tcMar>
+            <w:tcW w:type="dxa" w:w="1007"/>
           </w:tcPr>
           <w:p>
             <w:pPr>
-              <w:autoSpaceDN w:val="0"/>
-              <w:autoSpaceDE w:val="0"/>
-              <w:widowControl/>
-              <w:spacing w:line="200" w:lineRule="exact" w:before="72" w:after="0"/>
-              <w:ind w:left="72" w:right="0" w:firstLine="0"/>
-              <w:jc w:val="left"/>
+              <w:spacing w:after="0"/>
             </w:pPr>
             <w:r>
               <w:rPr>
-                <w:w w:val="97.33333587646484"/>
-                <w:rFonts w:ascii="Helvetica" w:hAnsi="Helvetica" w:eastAsia="Helvetica"/>
-                <w:b w:val="0"/>
-                <w:i w:val="0"/>
-                <w:color w:val="000000"/>
-                <w:sz w:val="15"/>
+                <w:rFonts w:ascii="Arial" w:hAnsi="Arial"/>
+                <w:sz w:val="16"/>
               </w:rPr>
               <w:t>28/01/26</w:t>
             </w:r>
@@ -1312,85 +618,33 @@
         </w:tc>
         <w:tc>
           <w:tcPr>
-            <w:tcW w:type="dxa" w:w="4200"/>
-            <w:tcBorders>
-              <w:start w:sz="7.199999809265137" w:val="single" w:color="#595959"/>
-              <w:top w:sz="7.199999809265137" w:val="single" w:color="#595959"/>
-              <w:end w:sz="7.199999809265137" w:val="single" w:color="#595959"/>
-              <w:bottom w:sz="7.199999809265137" w:val="single" w:color="#595959"/>
-            </w:tcBorders>
-            <w:tcMar>
-              <w:start w:w="0" w:type="dxa"/>
-              <w:end w:w="0" w:type="dxa"/>
-            </w:tcMar>
+            <w:tcW w:type="dxa" w:w="3671"/>
           </w:tcPr>
           <w:p>
             <w:pPr>
-              <w:autoSpaceDN w:val="0"/>
-              <w:autoSpaceDE w:val="0"/>
-              <w:widowControl/>
-              <w:spacing w:line="216" w:lineRule="exact" w:before="56" w:after="0"/>
-              <w:ind w:left="72" w:right="144" w:firstLine="0"/>
-              <w:jc w:val="left"/>
+              <w:spacing w:after="0"/>
             </w:pPr>
             <w:r>
               <w:rPr>
-                <w:w w:val="97.33333587646484"/>
-                <w:rFonts w:ascii="Helvetica" w:hAnsi="Helvetica" w:eastAsia="Helvetica"/>
-                <w:b w:val="0"/>
-                <w:i w:val="0"/>
-                <w:color w:val="000000"/>
-                <w:sz w:val="15"/>
+                <w:rFonts w:ascii="Arial" w:hAnsi="Arial"/>
+                <w:sz w:val="16"/>
               </w:rPr>
-              <w:t xml:space="preserve">REGULARIZACION FINAL DE PERIODO POR </w:t>
-            </w:r>
-            <w:r>
-              <w:br/>
-            </w:r>
-            <w:r>
-              <w:rPr>
-                <w:w w:val="97.33333587646484"/>
-                <w:rFonts w:ascii="Helvetica" w:hAnsi="Helvetica" w:eastAsia="Helvetica"/>
-                <w:b w:val="0"/>
-                <w:i w:val="0"/>
-                <w:color w:val="000000"/>
-                <w:sz w:val="15"/>
-              </w:rPr>
-              <w:t>DIFERENCIAS DE REDONDEO Y AJUSTE AUTOMATICO</w:t>
+              <w:t>REGULARIZACION FINAL DE PERIODO POR DIFERENCIAS DE REDONDEO Y AJUSTE AUTOMATICO</w:t>
             </w:r>
           </w:p>
         </w:tc>
         <w:tc>
           <w:tcPr>
-            <w:tcW w:type="dxa" w:w="1240"/>
-            <w:tcBorders>
-              <w:start w:sz="7.199999809265137" w:val="single" w:color="#595959"/>
-              <w:top w:sz="7.199999809265137" w:val="single" w:color="#595959"/>
-              <w:end w:sz="7.199999809265137" w:val="single" w:color="#595959"/>
-              <w:bottom w:sz="7.199999809265137" w:val="single" w:color="#595959"/>
-            </w:tcBorders>
-            <w:tcMar>
-              <w:start w:w="0" w:type="dxa"/>
-              <w:end w:w="0" w:type="dxa"/>
-            </w:tcMar>
+            <w:tcW w:type="dxa" w:w="936"/>
           </w:tcPr>
           <w:p>
             <w:pPr>
-              <w:autoSpaceDN w:val="0"/>
-              <w:autoSpaceDE w:val="0"/>
-              <w:widowControl/>
-              <w:spacing w:line="200" w:lineRule="exact" w:before="72" w:after="0"/>
-              <w:ind w:left="72" w:right="0" w:firstLine="0"/>
-              <w:jc w:val="left"/>
+              <w:spacing w:after="0"/>
             </w:pPr>
             <w:r>
               <w:rPr>
-                <w:w w:val="97.33333587646484"/>
-                <w:rFonts w:ascii="Helvetica" w:hAnsi="Helvetica" w:eastAsia="Helvetica"/>
-                <w:b w:val="0"/>
-                <w:i w:val="0"/>
-                <w:color w:val="000000"/>
-                <w:sz w:val="15"/>
+                <w:rFonts w:ascii="Arial" w:hAnsi="Arial"/>
+                <w:sz w:val="16"/>
               </w:rPr>
               <w:t>1,34</w:t>
             </w:r>
@@ -1398,35 +652,16 @@
         </w:tc>
         <w:tc>
           <w:tcPr>
-            <w:tcW w:type="dxa" w:w="1240"/>
-            <w:tcBorders>
-              <w:start w:sz="7.199999809265137" w:val="single" w:color="#595959"/>
-              <w:top w:sz="7.199999809265137" w:val="single" w:color="#595959"/>
-              <w:end w:sz="7.199999809265137" w:val="single" w:color="#595959"/>
-              <w:bottom w:sz="7.199999809265137" w:val="single" w:color="#595959"/>
-            </w:tcBorders>
-            <w:tcMar>
-              <w:start w:w="0" w:type="dxa"/>
-              <w:end w:w="0" w:type="dxa"/>
-            </w:tcMar>
+            <w:tcW w:type="dxa" w:w="936"/>
           </w:tcPr>
           <w:p>
             <w:pPr>
-              <w:autoSpaceDN w:val="0"/>
-              <w:autoSpaceDE w:val="0"/>
-              <w:widowControl/>
-              <w:spacing w:line="200" w:lineRule="exact" w:before="72" w:after="0"/>
-              <w:ind w:left="72" w:right="0" w:firstLine="0"/>
-              <w:jc w:val="left"/>
+              <w:spacing w:after="0"/>
             </w:pPr>
             <w:r>
               <w:rPr>
-                <w:w w:val="97.33333587646484"/>
-                <w:rFonts w:ascii="Helvetica" w:hAnsi="Helvetica" w:eastAsia="Helvetica"/>
-                <w:b w:val="0"/>
-                <w:i w:val="0"/>
-                <w:color w:val="000000"/>
-                <w:sz w:val="15"/>
+                <w:rFonts w:ascii="Arial" w:hAnsi="Arial"/>
+                <w:sz w:val="16"/>
               </w:rPr>
               <w:t>0,00</w:t>
             </w:r>
@@ -1434,35 +669,16 @@
         </w:tc>
         <w:tc>
           <w:tcPr>
-            <w:tcW w:type="dxa" w:w="3096"/>
-            <w:tcBorders>
-              <w:start w:sz="7.199999809265137" w:val="single" w:color="#595959"/>
-              <w:top w:sz="7.199999809265137" w:val="single" w:color="#595959"/>
-              <w:end w:sz="7.199999809265137" w:val="single" w:color="#595959"/>
-              <w:bottom w:sz="7.199999809265137" w:val="single" w:color="#595959"/>
-            </w:tcBorders>
-            <w:tcMar>
-              <w:start w:w="0" w:type="dxa"/>
-              <w:end w:w="0" w:type="dxa"/>
-            </w:tcMar>
+            <w:tcW w:type="dxa" w:w="2880"/>
           </w:tcPr>
           <w:p>
             <w:pPr>
-              <w:autoSpaceDN w:val="0"/>
-              <w:autoSpaceDE w:val="0"/>
-              <w:widowControl/>
-              <w:spacing w:line="200" w:lineRule="exact" w:before="72" w:after="0"/>
-              <w:ind w:left="72" w:right="0" w:firstLine="0"/>
-              <w:jc w:val="left"/>
+              <w:spacing w:after="0"/>
             </w:pPr>
             <w:r>
               <w:rPr>
-                <w:w w:val="97.33333587646484"/>
-                <w:rFonts w:ascii="Helvetica" w:hAnsi="Helvetica" w:eastAsia="Helvetica"/>
-                <w:b w:val="0"/>
-                <w:i w:val="0"/>
-                <w:color w:val="000000"/>
-                <w:sz w:val="15"/>
+                <w:rFonts w:ascii="Arial" w:hAnsi="Arial"/>
+                <w:sz w:val="16"/>
               </w:rPr>
               <w:t>Ajuste contable menor</w:t>
             </w:r>
@@ -1470,73 +686,36 @@
         </w:tc>
       </w:tr>
     </w:tbl>
-    <w:p>
-      <w:pPr>
-        <w:autoSpaceDN w:val="0"/>
-        <w:autoSpaceDE w:val="0"/>
-        <w:widowControl/>
-        <w:spacing w:line="302" w:lineRule="exact" w:before="472" w:after="250"/>
-        <w:ind w:left="8" w:right="0" w:firstLine="0"/>
-        <w:jc w:val="left"/>
-      </w:pPr>
-      <w:r>
-        <w:rPr>
-          <w:rFonts w:ascii="Helvetica" w:hAnsi="Helvetica" w:eastAsia="Helvetica"/>
-          <w:b w:val="0"/>
-          <w:i w:val="0"/>
-          <w:color w:val="000000"/>
-          <w:sz w:val="22"/>
-        </w:rPr>
-        <w:t>Totales del periodo</w:t>
-      </w:r>
-    </w:p>
+    <w:p/>
     <w:tbl>
       <w:tblPr>
+        <w:tblStyle w:val="TableGrid"/>
         <w:tblW w:type="auto" w:w="0"/>
+        <w:jc w:val="center"/>
         <w:tblLayout w:type="fixed"/>
         <w:tblLook w:firstColumn="1" w:firstRow="1" w:lastColumn="0" w:lastRow="0" w:noHBand="0" w:noVBand="1" w:val="04A0"/>
-        <w:tblInd w:w="7.999999999999972" w:type="dxa"/>
       </w:tblPr>
       <w:tblGrid>
-        <w:gridCol w:w="3649"/>
-        <w:gridCol w:w="3649"/>
-        <w:gridCol w:w="3649"/>
+        <w:gridCol w:w="5472"/>
+        <w:gridCol w:w="1944"/>
+        <w:gridCol w:w="1440"/>
       </w:tblGrid>
       <w:tr>
         <w:trPr>
-          <w:trHeight w:hRule="exact" w:val="600"/>
+          <w:trHeight w:val="403" w:hRule="atLeast"/>
         </w:trPr>
         <w:tc>
           <w:tcPr>
-            <w:tcW w:type="dxa" w:w="5340"/>
-            <w:tcBorders>
-              <w:start w:sz="7.199999809265137" w:val="single" w:color="#595959"/>
-              <w:top w:sz="7.199999809265137" w:val="single" w:color="#595959"/>
-              <w:end w:sz="7.199999809265137" w:val="single" w:color="#595959"/>
-              <w:bottom w:sz="7.199999809265137" w:val="single" w:color="#595959"/>
-            </w:tcBorders>
-            <w:shd w:fill="efefef"/>
-            <w:tcMar>
-              <w:start w:w="0" w:type="dxa"/>
-              <w:end w:w="0" w:type="dxa"/>
-            </w:tcMar>
+            <w:tcW w:type="dxa" w:w="5472"/>
           </w:tcPr>
           <w:p>
             <w:pPr>
-              <w:autoSpaceDN w:val="0"/>
-              <w:autoSpaceDE w:val="0"/>
-              <w:widowControl/>
-              <w:spacing w:line="248" w:lineRule="exact" w:before="72" w:after="0"/>
-              <w:ind w:left="72" w:right="0" w:firstLine="0"/>
-              <w:jc w:val="left"/>
+              <w:spacing w:after="0"/>
             </w:pPr>
             <w:r>
               <w:rPr>
-                <w:rFonts w:ascii="Helvetica" w:hAnsi="Helvetica" w:eastAsia="Helvetica"/>
-                <w:b w:val="0"/>
-                <w:i w:val="0"/>
-                <w:color w:val="000000"/>
-                <w:sz w:val="18"/>
+                <w:rFonts w:ascii="Arial" w:hAnsi="Arial"/>
+                <w:sz w:val="16"/>
               </w:rPr>
               <w:t>Total gastos</w:t>
             </w:r>
@@ -1544,34 +723,16 @@
         </w:tc>
         <w:tc>
           <w:tcPr>
-            <w:tcW w:type="dxa" w:w="2200"/>
-            <w:tcBorders>
-              <w:start w:sz="7.199999809265137" w:val="single" w:color="#595959"/>
-              <w:top w:sz="7.199999809265137" w:val="single" w:color="#595959"/>
-              <w:end w:sz="7.199999809265137" w:val="single" w:color="#595959"/>
-              <w:bottom w:sz="7.199999809265137" w:val="single" w:color="#595959"/>
-            </w:tcBorders>
-            <w:tcMar>
-              <w:start w:w="0" w:type="dxa"/>
-              <w:end w:w="0" w:type="dxa"/>
-            </w:tcMar>
+            <w:tcW w:type="dxa" w:w="1944"/>
           </w:tcPr>
           <w:p>
             <w:pPr>
-              <w:autoSpaceDN w:val="0"/>
-              <w:autoSpaceDE w:val="0"/>
-              <w:widowControl/>
-              <w:spacing w:line="248" w:lineRule="exact" w:before="72" w:after="0"/>
-              <w:ind w:left="72" w:right="0" w:firstLine="0"/>
-              <w:jc w:val="left"/>
+              <w:spacing w:after="0"/>
             </w:pPr>
             <w:r>
               <w:rPr>
-                <w:rFonts w:ascii="Helvetica" w:hAnsi="Helvetica" w:eastAsia="Helvetica"/>
-                <w:b w:val="0"/>
-                <w:i w:val="0"/>
-                <w:color w:val="000000"/>
-                <w:sz w:val="18"/>
+                <w:rFonts w:ascii="Arial" w:hAnsi="Arial"/>
+                <w:sz w:val="16"/>
               </w:rPr>
               <w:t>265,06</w:t>
             </w:r>
@@ -1579,34 +740,16 @@
         </w:tc>
         <w:tc>
           <w:tcPr>
-            <w:tcW w:type="dxa" w:w="2440"/>
-            <w:tcBorders>
-              <w:start w:sz="7.199999809265137" w:val="single" w:color="#595959"/>
-              <w:top w:sz="7.199999809265137" w:val="single" w:color="#595959"/>
-              <w:end w:sz="7.199999809265137" w:val="single" w:color="#595959"/>
-              <w:bottom w:sz="7.199999809265137" w:val="single" w:color="#595959"/>
-            </w:tcBorders>
-            <w:tcMar>
-              <w:start w:w="0" w:type="dxa"/>
-              <w:end w:w="0" w:type="dxa"/>
-            </w:tcMar>
+            <w:tcW w:type="dxa" w:w="1440"/>
           </w:tcPr>
           <w:p>
             <w:pPr>
-              <w:autoSpaceDN w:val="0"/>
-              <w:autoSpaceDE w:val="0"/>
-              <w:widowControl/>
-              <w:spacing w:line="248" w:lineRule="exact" w:before="72" w:after="0"/>
-              <w:ind w:left="72" w:right="0" w:firstLine="0"/>
-              <w:jc w:val="left"/>
+              <w:spacing w:after="0"/>
             </w:pPr>
             <w:r>
               <w:rPr>
-                <w:rFonts w:ascii="Helvetica" w:hAnsi="Helvetica" w:eastAsia="Helvetica"/>
-                <w:b w:val="0"/>
-                <w:i w:val="0"/>
-                <w:color w:val="000000"/>
-                <w:sz w:val="18"/>
+                <w:rFonts w:ascii="Arial" w:hAnsi="Arial"/>
+                <w:sz w:val="16"/>
               </w:rPr>
               <w:t>EUR</w:t>
             </w:r>
@@ -1615,39 +758,20 @@
       </w:tr>
       <w:tr>
         <w:trPr>
-          <w:trHeight w:hRule="exact" w:val="600"/>
+          <w:trHeight w:val="403" w:hRule="atLeast"/>
         </w:trPr>
         <w:tc>
           <w:tcPr>
-            <w:tcW w:type="dxa" w:w="5340"/>
-            <w:tcBorders>
-              <w:start w:sz="7.199999809265137" w:val="single" w:color="#595959"/>
-              <w:top w:sz="7.199999809265137" w:val="single" w:color="#595959"/>
-              <w:end w:sz="7.199999809265137" w:val="single" w:color="#595959"/>
-              <w:bottom w:sz="7.199999809265137" w:val="single" w:color="#595959"/>
-            </w:tcBorders>
-            <w:shd w:fill="efefef"/>
-            <w:tcMar>
-              <w:start w:w="0" w:type="dxa"/>
-              <w:end w:w="0" w:type="dxa"/>
-            </w:tcMar>
+            <w:tcW w:type="dxa" w:w="5472"/>
           </w:tcPr>
           <w:p>
             <w:pPr>
-              <w:autoSpaceDN w:val="0"/>
-              <w:autoSpaceDE w:val="0"/>
-              <w:widowControl/>
-              <w:spacing w:line="248" w:lineRule="exact" w:before="72" w:after="0"/>
-              <w:ind w:left="72" w:right="0" w:firstLine="0"/>
-              <w:jc w:val="left"/>
+              <w:spacing w:after="0"/>
             </w:pPr>
             <w:r>
               <w:rPr>
-                <w:rFonts w:ascii="Helvetica" w:hAnsi="Helvetica" w:eastAsia="Helvetica"/>
-                <w:b w:val="0"/>
-                <w:i w:val="0"/>
-                <w:color w:val="000000"/>
-                <w:sz w:val="18"/>
+                <w:rFonts w:ascii="Arial" w:hAnsi="Arial"/>
+                <w:sz w:val="16"/>
               </w:rPr>
               <w:t>Total ingresos</w:t>
             </w:r>
@@ -1655,34 +779,16 @@
         </w:tc>
         <w:tc>
           <w:tcPr>
-            <w:tcW w:type="dxa" w:w="2200"/>
-            <w:tcBorders>
-              <w:start w:sz="7.199999809265137" w:val="single" w:color="#595959"/>
-              <w:top w:sz="7.199999809265137" w:val="single" w:color="#595959"/>
-              <w:end w:sz="7.199999809265137" w:val="single" w:color="#595959"/>
-              <w:bottom w:sz="7.199999809265137" w:val="single" w:color="#595959"/>
-            </w:tcBorders>
-            <w:tcMar>
-              <w:start w:w="0" w:type="dxa"/>
-              <w:end w:w="0" w:type="dxa"/>
-            </w:tcMar>
+            <w:tcW w:type="dxa" w:w="1944"/>
           </w:tcPr>
           <w:p>
             <w:pPr>
-              <w:autoSpaceDN w:val="0"/>
-              <w:autoSpaceDE w:val="0"/>
-              <w:widowControl/>
-              <w:spacing w:line="248" w:lineRule="exact" w:before="72" w:after="0"/>
-              <w:ind w:left="72" w:right="0" w:firstLine="0"/>
-              <w:jc w:val="left"/>
+              <w:spacing w:after="0"/>
             </w:pPr>
             <w:r>
               <w:rPr>
-                <w:rFonts w:ascii="Helvetica" w:hAnsi="Helvetica" w:eastAsia="Helvetica"/>
-                <w:b w:val="0"/>
-                <w:i w:val="0"/>
-                <w:color w:val="000000"/>
-                <w:sz w:val="18"/>
+                <w:rFonts w:ascii="Arial" w:hAnsi="Arial"/>
+                <w:sz w:val="16"/>
               </w:rPr>
               <w:t>334,50</w:t>
             </w:r>
@@ -1690,34 +796,16 @@
         </w:tc>
         <w:tc>
           <w:tcPr>
-            <w:tcW w:type="dxa" w:w="2440"/>
-            <w:tcBorders>
-              <w:start w:sz="7.199999809265137" w:val="single" w:color="#595959"/>
-              <w:top w:sz="7.199999809265137" w:val="single" w:color="#595959"/>
-              <w:end w:sz="7.199999809265137" w:val="single" w:color="#595959"/>
-              <w:bottom w:sz="7.199999809265137" w:val="single" w:color="#595959"/>
-            </w:tcBorders>
-            <w:tcMar>
-              <w:start w:w="0" w:type="dxa"/>
-              <w:end w:w="0" w:type="dxa"/>
-            </w:tcMar>
+            <w:tcW w:type="dxa" w:w="1440"/>
           </w:tcPr>
           <w:p>
             <w:pPr>
-              <w:autoSpaceDN w:val="0"/>
-              <w:autoSpaceDE w:val="0"/>
-              <w:widowControl/>
-              <w:spacing w:line="248" w:lineRule="exact" w:before="72" w:after="0"/>
-              <w:ind w:left="72" w:right="0" w:firstLine="0"/>
-              <w:jc w:val="left"/>
+              <w:spacing w:after="0"/>
             </w:pPr>
             <w:r>
               <w:rPr>
-                <w:rFonts w:ascii="Helvetica" w:hAnsi="Helvetica" w:eastAsia="Helvetica"/>
-                <w:b w:val="0"/>
-                <w:i w:val="0"/>
-                <w:color w:val="000000"/>
-                <w:sz w:val="18"/>
+                <w:rFonts w:ascii="Arial" w:hAnsi="Arial"/>
+                <w:sz w:val="16"/>
               </w:rPr>
               <w:t>EUR</w:t>
             </w:r>
@@ -1726,39 +814,20 @@
       </w:tr>
       <w:tr>
         <w:trPr>
-          <w:trHeight w:hRule="exact" w:val="600"/>
+          <w:trHeight w:val="403" w:hRule="atLeast"/>
         </w:trPr>
         <w:tc>
           <w:tcPr>
-            <w:tcW w:type="dxa" w:w="5340"/>
-            <w:tcBorders>
-              <w:start w:sz="7.199999809265137" w:val="single" w:color="#595959"/>
-              <w:top w:sz="7.199999809265137" w:val="single" w:color="#595959"/>
-              <w:end w:sz="7.199999809265137" w:val="single" w:color="#595959"/>
-              <w:bottom w:sz="7.199999809265137" w:val="single" w:color="#595959"/>
-            </w:tcBorders>
-            <w:shd w:fill="dbeddb"/>
-            <w:tcMar>
-              <w:start w:w="0" w:type="dxa"/>
-              <w:end w:w="0" w:type="dxa"/>
-            </w:tcMar>
+            <w:tcW w:type="dxa" w:w="5472"/>
           </w:tcPr>
           <w:p>
             <w:pPr>
-              <w:autoSpaceDN w:val="0"/>
-              <w:autoSpaceDE w:val="0"/>
-              <w:widowControl/>
-              <w:spacing w:line="248" w:lineRule="exact" w:before="72" w:after="0"/>
-              <w:ind w:left="72" w:right="0" w:firstLine="0"/>
-              <w:jc w:val="left"/>
+              <w:spacing w:after="0"/>
             </w:pPr>
             <w:r>
               <w:rPr>
-                <w:rFonts w:ascii="Helvetica" w:hAnsi="Helvetica" w:eastAsia="Helvetica"/>
-                <w:b w:val="0"/>
-                <w:i w:val="0"/>
-                <w:color w:val="000000"/>
-                <w:sz w:val="18"/>
+                <w:rFonts w:ascii="Arial" w:hAnsi="Arial"/>
+                <w:sz w:val="16"/>
               </w:rPr>
               <w:t>Saldo del periodo</w:t>
             </w:r>
@@ -1766,35 +835,16 @@
         </w:tc>
         <w:tc>
           <w:tcPr>
-            <w:tcW w:type="dxa" w:w="2200"/>
-            <w:tcBorders>
-              <w:start w:sz="7.199999809265137" w:val="single" w:color="#595959"/>
-              <w:top w:sz="7.199999809265137" w:val="single" w:color="#595959"/>
-              <w:end w:sz="7.199999809265137" w:val="single" w:color="#595959"/>
-              <w:bottom w:sz="7.199999809265137" w:val="single" w:color="#595959"/>
-            </w:tcBorders>
-            <w:shd w:fill="dbeddb"/>
-            <w:tcMar>
-              <w:start w:w="0" w:type="dxa"/>
-              <w:end w:w="0" w:type="dxa"/>
-            </w:tcMar>
+            <w:tcW w:type="dxa" w:w="1944"/>
           </w:tcPr>
           <w:p>
             <w:pPr>
-              <w:autoSpaceDN w:val="0"/>
-              <w:autoSpaceDE w:val="0"/>
-              <w:widowControl/>
-              <w:spacing w:line="248" w:lineRule="exact" w:before="72" w:after="0"/>
-              <w:ind w:left="72" w:right="0" w:firstLine="0"/>
-              <w:jc w:val="left"/>
+              <w:spacing w:after="0"/>
             </w:pPr>
             <w:r>
               <w:rPr>
-                <w:rFonts w:ascii="Helvetica" w:hAnsi="Helvetica" w:eastAsia="Helvetica"/>
-                <w:b w:val="0"/>
-                <w:i w:val="0"/>
-                <w:color w:val="000000"/>
-                <w:sz w:val="18"/>
+                <w:rFonts w:ascii="Arial" w:hAnsi="Arial"/>
+                <w:sz w:val="16"/>
               </w:rPr>
               <w:t>69,44</w:t>
             </w:r>
@@ -1802,35 +852,16 @@
         </w:tc>
         <w:tc>
           <w:tcPr>
-            <w:tcW w:type="dxa" w:w="2440"/>
-            <w:tcBorders>
-              <w:start w:sz="7.199999809265137" w:val="single" w:color="#595959"/>
-              <w:top w:sz="7.199999809265137" w:val="single" w:color="#595959"/>
-              <w:end w:sz="7.199999809265137" w:val="single" w:color="#595959"/>
-              <w:bottom w:sz="7.199999809265137" w:val="single" w:color="#595959"/>
-            </w:tcBorders>
-            <w:shd w:fill="dbeddb"/>
-            <w:tcMar>
-              <w:start w:w="0" w:type="dxa"/>
-              <w:end w:w="0" w:type="dxa"/>
-            </w:tcMar>
+            <w:tcW w:type="dxa" w:w="1440"/>
           </w:tcPr>
           <w:p>
             <w:pPr>
-              <w:autoSpaceDN w:val="0"/>
-              <w:autoSpaceDE w:val="0"/>
-              <w:widowControl/>
-              <w:spacing w:line="248" w:lineRule="exact" w:before="72" w:after="0"/>
-              <w:ind w:left="72" w:right="0" w:firstLine="0"/>
-              <w:jc w:val="left"/>
+              <w:spacing w:after="0"/>
             </w:pPr>
             <w:r>
               <w:rPr>
-                <w:rFonts w:ascii="Helvetica" w:hAnsi="Helvetica" w:eastAsia="Helvetica"/>
-                <w:b w:val="0"/>
-                <w:i w:val="0"/>
-                <w:color w:val="000000"/>
-                <w:sz w:val="18"/>
+                <w:rFonts w:ascii="Arial" w:hAnsi="Arial"/>
+                <w:sz w:val="16"/>
               </w:rPr>
               <w:t>EUR</w:t>
             </w:r>
@@ -1838,40 +869,19 @@
         </w:tc>
       </w:tr>
     </w:tbl>
+    <w:p/>
     <w:p>
       <w:pPr>
-        <w:autoSpaceDN w:val="0"/>
-        <w:autoSpaceDE w:val="0"/>
-        <w:widowControl/>
-        <w:spacing w:line="236" w:lineRule="exact" w:before="336" w:after="0"/>
-        <w:ind w:left="8" w:right="1008" w:firstLine="0"/>
-        <w:jc w:val="left"/>
+        <w:spacing w:after="160"/>
       </w:pPr>
       <w:r>
-        <w:rPr>
-          <w:rFonts w:ascii="Helvetica" w:hAnsi="Helvetica" w:eastAsia="Helvetica"/>
-          <w:b w:val="0"/>
-          <w:i w:val="0"/>
-          <w:color w:val="000000"/>
-          <w:sz w:val="16"/>
-        </w:rPr>
-        <w:t xml:space="preserve">Notas para la prueba: tras convertir a Word, deberia poder editarse la columna 'Concepto rectificado', cambiar cualquier texto de concepto y </w:t>
-      </w:r>
-      <w:r>
-        <w:rPr>
-          <w:rFonts w:ascii="Helvetica" w:hAnsi="Helvetica" w:eastAsia="Helvetica"/>
-          <w:b w:val="0"/>
-          <w:i w:val="0"/>
-          <w:color w:val="000000"/>
-          <w:sz w:val="16"/>
-        </w:rPr>
-        <w:t>conservar una tabla suficientemente legible para imprimir.</w:t>
+        <w:t>Notas para la prueba: tras convertir a Word, deberia poder editarse la columna 'Concepto rectificado', cambiar cualquier texto de concepto y conservar una tabla suficientemente legible para imprimir.</w:t>
       </w:r>
     </w:p>
     <w:sectPr>
-      <w:pgSz w:w="11900" w:h="16840"/>
-      <w:pgMar w:top="360" w:right="0" w:bottom="1440" w:left="952" w:header="720" w:footer="720" w:gutter="0"/>
-      <w:cols/>
+      <w:pgSz w:w="12240" w:h="15840"/>
+      <w:pgMar w:top="648" w:right="648" w:bottom="648" w:left="648" w:header="720" w:footer="720" w:gutter="0"/>
+      <w:cols w:space="720"/>
       <w:docGrid w:linePitch="360"/>
     </w:sectPr>
   </w:body>
@@ -2241,6 +1251,10 @@
     <w:name w:val="Normal"/>
     <w:qFormat/>
     <w:rsid w:val="00FC693F"/>
+    <w:rPr>
+      <w:rFonts w:ascii="Arial" w:hAnsi="Arial"/>
+      <w:sz w:val="18"/>
+    </w:rPr>
   </w:style>
   <w:style w:type="paragraph" w:styleId="Header">
     <w:name w:val="header"/>

</xml_diff>

<commit_message>
Extract real PDF formatting in editable mode and drop DOC output
The editable (table) mode now mirrors the source PDF instead of using
hardcoded styles: fonts, sizes, bold/italic, text colors, cell shading,
border color/width, alignments, indents, exact page geometry, column
widths, row heights, merged cells and embedded icons are all read from
the PDF itself. Compensates Word rendering quirks (per-row height
drift, spacer height, table anchor offset) so pages line up with the
original within half a point.

Also removes the legacy LibreOffice-based .doc output path and bumps
the version to 1.3.0.

Co-Authored-By: Claude Fable 5 <noreply@anthropic.com>
</commit_message>
<xml_diff>
--- a/samples/ejemplo-contabilidad-parroquia.docx
+++ b/samples/ejemplo-contabilidad-parroquia.docx
@@ -4,64 +4,155 @@
   <w:body>
     <w:p>
       <w:pPr>
-        <w:jc w:val="center"/>
+        <w:spacing w:before="0" w:after="0" w:line="412" w:lineRule="exact"/>
       </w:pPr>
       <w:r>
         <w:rPr>
-          <w:b/>
-          <w:sz w:val="28"/>
+          <w:rFonts w:ascii="Helvetica" w:hAnsi="Helvetica"/>
+          <w:b w:val="0"/>
+          <w:i w:val="0"/>
+          <w:sz w:val="30"/>
         </w:rPr>
         <w:t>PARROQUIA DE SAN JOSE - RESUMEN CONTABLE PARA TABLON</w:t>
       </w:r>
     </w:p>
     <w:p>
       <w:pPr>
-        <w:spacing w:after="160"/>
+        <w:spacing w:before="0" w:after="0" w:line="132" w:lineRule="exact"/>
+      </w:pPr>
+    </w:p>
+    <w:p>
+      <w:pPr>
+        <w:spacing w:before="0" w:after="0" w:line="247" w:lineRule="exact"/>
       </w:pPr>
       <w:r>
+        <w:rPr>
+          <w:rFonts w:ascii="Helvetica" w:hAnsi="Helvetica"/>
+          <w:b w:val="0"/>
+          <w:i w:val="0"/>
+          <w:sz w:val="18"/>
+        </w:rPr>
         <w:t>Periodo: enero 2026 | Documento de ejemplo para probar conversion PDF a Word</w:t>
       </w:r>
     </w:p>
     <w:p>
       <w:pPr>
-        <w:spacing w:after="160"/>
+        <w:spacing w:before="0" w:after="0" w:line="537" w:lineRule="exact"/>
+      </w:pPr>
+    </w:p>
+    <w:p>
+      <w:pPr>
+        <w:spacing w:before="0" w:after="0" w:line="247" w:lineRule="exact"/>
       </w:pPr>
       <w:r>
-        <w:t>Este documento simula el tipo de PDF contable que se recibe desde un programa externo. El objetivo de la conversion es poder abrirlo en Word, rectificar conceptos largos o poco claros, revisar importes y despues imprimirlo para exponerlo en el tablon de anuncios.</w:t>
+        <w:rPr>
+          <w:rFonts w:ascii="Helvetica" w:hAnsi="Helvetica"/>
+          <w:b w:val="0"/>
+          <w:i w:val="0"/>
+          <w:sz w:val="18"/>
+        </w:rPr>
+        <w:t>Este documento simula el tipo de PDF contable que se recibe desde un programa externo. El objetivo de la conversion es</w:t>
       </w:r>
+    </w:p>
+    <w:p>
+      <w:pPr>
+        <w:spacing w:before="0" w:after="0" w:line="15" w:lineRule="exact"/>
+      </w:pPr>
+    </w:p>
+    <w:p>
+      <w:pPr>
+        <w:spacing w:before="0" w:after="0" w:line="247" w:lineRule="exact"/>
+      </w:pPr>
+      <w:r>
+        <w:rPr>
+          <w:rFonts w:ascii="Helvetica" w:hAnsi="Helvetica"/>
+          <w:b w:val="0"/>
+          <w:i w:val="0"/>
+          <w:sz w:val="18"/>
+        </w:rPr>
+        <w:t>poder abrirlo en Word, rectificar conceptos largos o poco claros, revisar importes y despues imprimirlo para exponerlo en el</w:t>
+      </w:r>
+    </w:p>
+    <w:p>
+      <w:pPr>
+        <w:spacing w:before="0" w:after="0" w:line="15" w:lineRule="exact"/>
+      </w:pPr>
+    </w:p>
+    <w:p>
+      <w:pPr>
+        <w:spacing w:before="0" w:after="0" w:line="247" w:lineRule="exact"/>
+      </w:pPr>
+      <w:r>
+        <w:rPr>
+          <w:rFonts w:ascii="Helvetica" w:hAnsi="Helvetica"/>
+          <w:b w:val="0"/>
+          <w:i w:val="0"/>
+          <w:sz w:val="18"/>
+        </w:rPr>
+        <w:t>tablon de anuncios.</w:t>
+      </w:r>
+    </w:p>
+    <w:p>
+      <w:pPr>
+        <w:spacing w:before="0" w:after="0" w:line="525" w:lineRule="exact"/>
+      </w:pPr>
     </w:p>
     <w:tbl>
       <w:tblPr>
         <w:tblStyle w:val="TableGrid"/>
         <w:tblW w:type="auto" w:w="0"/>
-        <w:jc w:val="center"/>
         <w:tblLayout w:type="fixed"/>
         <w:tblLook w:firstColumn="1" w:firstRow="1" w:lastColumn="0" w:lastRow="0" w:noHBand="0" w:noVBand="1" w:val="04A0"/>
+        <w:tblBorders>
+          <w:top w:val="single" w:sz="4" w:space="0" w:color="595959"/>
+          <w:left w:val="single" w:sz="4" w:space="0" w:color="595959"/>
+          <w:bottom w:val="single" w:sz="4" w:space="0" w:color="595959"/>
+          <w:right w:val="single" w:sz="4" w:space="0" w:color="595959"/>
+          <w:insideH w:val="single" w:sz="4" w:space="0" w:color="595959"/>
+          <w:insideV w:val="single" w:sz="4" w:space="0" w:color="595959"/>
+        </w:tblBorders>
+        <w:tblCellMar>
+          <w:top w:w="6" w:type="dxa"/>
+          <w:left w:w="16" w:type="dxa"/>
+          <w:bottom w:w="6" w:type="dxa"/>
+          <w:right w:w="16" w:type="dxa"/>
+        </w:tblCellMar>
+        <w:tblInd w:w="304" w:type="dxa"/>
       </w:tblPr>
       <w:tblGrid>
-        <w:gridCol w:w="1008"/>
-        <w:gridCol w:w="3672"/>
-        <w:gridCol w:w="936"/>
-        <w:gridCol w:w="936"/>
-        <w:gridCol w:w="2880"/>
+        <w:gridCol w:w="1160"/>
+        <w:gridCol w:w="4194"/>
+        <w:gridCol w:w="1246"/>
+        <w:gridCol w:w="1240"/>
+        <w:gridCol w:w="3100"/>
       </w:tblGrid>
       <w:tr>
         <w:trPr>
-          <w:trHeight w:val="490" w:hRule="atLeast"/>
+          <w:trHeight w:val="554" w:hRule="exact"/>
         </w:trPr>
         <w:tc>
           <w:tcPr>
-            <w:tcW w:type="dxa" w:w="1007"/>
-            <w:shd w:fill="E6E6E6"/>
+            <w:tcW w:type="dxa" w:w="1160"/>
+            <w:shd w:fill="E0E0E0"/>
+            <w:tcMar>
+              <w:top w:w="6" w:type="dxa"/>
+              <w:start w:w="16" w:type="dxa"/>
+              <w:bottom w:w="6" w:type="dxa"/>
+              <w:end w:w="16" w:type="dxa"/>
+            </w:tcMar>
+            <w:vAlign w:val="top"/>
           </w:tcPr>
           <w:p>
             <w:pPr>
-              <w:spacing w:after="0"/>
+              <w:spacing w:before="66" w:after="0" w:line="228" w:lineRule="exact"/>
+              <w:ind w:left="64"/>
+              <w:jc w:val="left"/>
             </w:pPr>
             <w:r>
               <w:rPr>
-                <w:rFonts w:ascii="Arial" w:hAnsi="Arial"/>
-                <w:b/>
+                <w:rFonts w:ascii="Helvetica" w:hAnsi="Helvetica"/>
+                <w:b w:val="0"/>
+                <w:i w:val="0"/>
                 <w:sz w:val="16"/>
               </w:rPr>
               <w:t>Fecha</w:t>
@@ -70,17 +161,27 @@
         </w:tc>
         <w:tc>
           <w:tcPr>
-            <w:tcW w:type="dxa" w:w="3671"/>
-            <w:shd w:fill="E6E6E6"/>
+            <w:tcW w:type="dxa" w:w="4194"/>
+            <w:shd w:fill="E0E0E0"/>
+            <w:tcMar>
+              <w:top w:w="6" w:type="dxa"/>
+              <w:start w:w="16" w:type="dxa"/>
+              <w:bottom w:w="6" w:type="dxa"/>
+              <w:end w:w="16" w:type="dxa"/>
+            </w:tcMar>
+            <w:vAlign w:val="top"/>
           </w:tcPr>
           <w:p>
             <w:pPr>
-              <w:spacing w:after="0"/>
+              <w:spacing w:before="66" w:after="0" w:line="228" w:lineRule="exact"/>
+              <w:ind w:left="64"/>
+              <w:jc w:val="left"/>
             </w:pPr>
             <w:r>
               <w:rPr>
-                <w:rFonts w:ascii="Arial" w:hAnsi="Arial"/>
-                <w:b/>
+                <w:rFonts w:ascii="Helvetica" w:hAnsi="Helvetica"/>
+                <w:b w:val="0"/>
+                <w:i w:val="0"/>
                 <w:sz w:val="16"/>
               </w:rPr>
               <w:t>Concepto generado por el programa</w:t>
@@ -89,17 +190,27 @@
         </w:tc>
         <w:tc>
           <w:tcPr>
-            <w:tcW w:type="dxa" w:w="936"/>
-            <w:shd w:fill="E6E6E6"/>
+            <w:tcW w:type="dxa" w:w="1246"/>
+            <w:shd w:fill="E0E0E0"/>
+            <w:tcMar>
+              <w:top w:w="6" w:type="dxa"/>
+              <w:start w:w="16" w:type="dxa"/>
+              <w:bottom w:w="6" w:type="dxa"/>
+              <w:end w:w="16" w:type="dxa"/>
+            </w:tcMar>
+            <w:vAlign w:val="top"/>
           </w:tcPr>
           <w:p>
             <w:pPr>
-              <w:spacing w:after="0"/>
+              <w:spacing w:before="66" w:after="0" w:line="228" w:lineRule="exact"/>
+              <w:ind w:left="70"/>
+              <w:jc w:val="left"/>
             </w:pPr>
             <w:r>
               <w:rPr>
-                <w:rFonts w:ascii="Arial" w:hAnsi="Arial"/>
-                <w:b/>
+                <w:rFonts w:ascii="Helvetica" w:hAnsi="Helvetica"/>
+                <w:b w:val="0"/>
+                <w:i w:val="0"/>
                 <w:sz w:val="16"/>
               </w:rPr>
               <w:t>Debe</w:t>
@@ -108,17 +219,27 @@
         </w:tc>
         <w:tc>
           <w:tcPr>
-            <w:tcW w:type="dxa" w:w="936"/>
-            <w:shd w:fill="E6E6E6"/>
+            <w:tcW w:type="dxa" w:w="1240"/>
+            <w:shd w:fill="E0E0E0"/>
+            <w:tcMar>
+              <w:top w:w="6" w:type="dxa"/>
+              <w:start w:w="16" w:type="dxa"/>
+              <w:bottom w:w="6" w:type="dxa"/>
+              <w:end w:w="16" w:type="dxa"/>
+            </w:tcMar>
+            <w:vAlign w:val="top"/>
           </w:tcPr>
           <w:p>
             <w:pPr>
-              <w:spacing w:after="0"/>
+              <w:spacing w:before="66" w:after="0" w:line="228" w:lineRule="exact"/>
+              <w:ind w:left="64"/>
+              <w:jc w:val="left"/>
             </w:pPr>
             <w:r>
               <w:rPr>
-                <w:rFonts w:ascii="Arial" w:hAnsi="Arial"/>
-                <w:b/>
+                <w:rFonts w:ascii="Helvetica" w:hAnsi="Helvetica"/>
+                <w:b w:val="0"/>
+                <w:i w:val="0"/>
                 <w:sz w:val="16"/>
               </w:rPr>
               <w:t>Haber</w:t>
@@ -127,17 +248,27 @@
         </w:tc>
         <w:tc>
           <w:tcPr>
-            <w:tcW w:type="dxa" w:w="2880"/>
-            <w:shd w:fill="E6E6E6"/>
+            <w:tcW w:type="dxa" w:w="3100"/>
+            <w:shd w:fill="E0E0E0"/>
+            <w:tcMar>
+              <w:top w:w="6" w:type="dxa"/>
+              <w:start w:w="16" w:type="dxa"/>
+              <w:bottom w:w="6" w:type="dxa"/>
+              <w:end w:w="16" w:type="dxa"/>
+            </w:tcMar>
+            <w:vAlign w:val="top"/>
           </w:tcPr>
           <w:p>
             <w:pPr>
-              <w:spacing w:after="0"/>
+              <w:spacing w:before="66" w:after="0" w:line="228" w:lineRule="exact"/>
+              <w:ind w:left="64"/>
+              <w:jc w:val="left"/>
             </w:pPr>
             <w:r>
               <w:rPr>
-                <w:rFonts w:ascii="Arial" w:hAnsi="Arial"/>
-                <w:b/>
+                <w:rFonts w:ascii="Helvetica" w:hAnsi="Helvetica"/>
+                <w:b w:val="0"/>
+                <w:i w:val="0"/>
                 <w:sz w:val="16"/>
               </w:rPr>
               <w:t>Concepto rectificado</w:t>
@@ -147,20 +278,31 @@
       </w:tr>
       <w:tr>
         <w:trPr>
-          <w:trHeight w:val="893" w:hRule="atLeast"/>
+          <w:trHeight w:val="1034" w:hRule="exact"/>
         </w:trPr>
         <w:tc>
           <w:tcPr>
-            <w:tcW w:type="dxa" w:w="1007"/>
+            <w:tcW w:type="dxa" w:w="1160"/>
+            <w:tcMar>
+              <w:top w:w="6" w:type="dxa"/>
+              <w:start w:w="16" w:type="dxa"/>
+              <w:bottom w:w="6" w:type="dxa"/>
+              <w:end w:w="16" w:type="dxa"/>
+            </w:tcMar>
+            <w:vAlign w:val="top"/>
           </w:tcPr>
           <w:p>
             <w:pPr>
-              <w:spacing w:after="0"/>
+              <w:spacing w:before="66" w:after="0" w:line="209" w:lineRule="exact"/>
+              <w:ind w:left="64"/>
+              <w:jc w:val="left"/>
             </w:pPr>
             <w:r>
               <w:rPr>
-                <w:rFonts w:ascii="Arial" w:hAnsi="Arial"/>
-                <w:sz w:val="16"/>
+                <w:rFonts w:ascii="Helvetica" w:hAnsi="Helvetica"/>
+                <w:b w:val="0"/>
+                <w:i w:val="0"/>
+                <w:sz w:val="15"/>
               </w:rPr>
               <w:t>03/01/26</w:t>
             </w:r>
@@ -168,33 +310,71 @@
         </w:tc>
         <w:tc>
           <w:tcPr>
-            <w:tcW w:type="dxa" w:w="3671"/>
+            <w:tcW w:type="dxa" w:w="4194"/>
+            <w:tcMar>
+              <w:top w:w="6" w:type="dxa"/>
+              <w:start w:w="16" w:type="dxa"/>
+              <w:bottom w:w="6" w:type="dxa"/>
+              <w:end w:w="16" w:type="dxa"/>
+            </w:tcMar>
+            <w:vAlign w:val="top"/>
           </w:tcPr>
           <w:p>
             <w:pPr>
-              <w:spacing w:after="0"/>
+              <w:spacing w:before="66" w:after="7" w:line="209" w:lineRule="exact"/>
+              <w:ind w:left="64"/>
+              <w:jc w:val="left"/>
             </w:pPr>
             <w:r>
               <w:rPr>
-                <w:rFonts w:ascii="Arial" w:hAnsi="Arial"/>
-                <w:sz w:val="16"/>
+                <w:rFonts w:ascii="Helvetica" w:hAnsi="Helvetica"/>
+                <w:b w:val="0"/>
+                <w:i w:val="0"/>
+                <w:sz w:val="15"/>
               </w:rPr>
-              <w:t>APUNTE AUTOMATICO 000431 - SERVICIOS GENERALES DIVERSOS NO CLASIFICADOS PARROQUIA DIECISEIS</w:t>
+              <w:t>APUNTE AUTOMATICO 000431 - SERVICIOS GENERALES</w:t>
+            </w:r>
+          </w:p>
+          <w:p>
+            <w:pPr>
+              <w:spacing w:before="0" w:after="0" w:line="209" w:lineRule="exact"/>
+              <w:ind w:left="64"/>
+              <w:jc w:val="left"/>
+            </w:pPr>
+            <w:r>
+              <w:rPr>
+                <w:rFonts w:ascii="Helvetica" w:hAnsi="Helvetica"/>
+                <w:b w:val="0"/>
+                <w:i w:val="0"/>
+                <w:sz w:val="15"/>
+              </w:rPr>
+              <w:t>DIVERSOS NO CLASIFICADOS PARROQUIA DIECISEIS</w:t>
             </w:r>
           </w:p>
         </w:tc>
         <w:tc>
           <w:tcPr>
-            <w:tcW w:type="dxa" w:w="936"/>
+            <w:tcW w:type="dxa" w:w="1246"/>
+            <w:tcMar>
+              <w:top w:w="6" w:type="dxa"/>
+              <w:start w:w="16" w:type="dxa"/>
+              <w:bottom w:w="6" w:type="dxa"/>
+              <w:end w:w="16" w:type="dxa"/>
+            </w:tcMar>
+            <w:vAlign w:val="top"/>
           </w:tcPr>
           <w:p>
             <w:pPr>
-              <w:spacing w:after="0"/>
+              <w:spacing w:before="66" w:after="0" w:line="209" w:lineRule="exact"/>
+              <w:ind w:left="70"/>
+              <w:jc w:val="left"/>
             </w:pPr>
             <w:r>
               <w:rPr>
-                <w:rFonts w:ascii="Arial" w:hAnsi="Arial"/>
-                <w:sz w:val="16"/>
+                <w:rFonts w:ascii="Helvetica" w:hAnsi="Helvetica"/>
+                <w:b w:val="0"/>
+                <w:i w:val="0"/>
+                <w:sz w:val="15"/>
               </w:rPr>
               <w:t>0,00</w:t>
             </w:r>
@@ -202,16 +382,27 @@
         </w:tc>
         <w:tc>
           <w:tcPr>
-            <w:tcW w:type="dxa" w:w="936"/>
+            <w:tcW w:type="dxa" w:w="1240"/>
+            <w:tcMar>
+              <w:top w:w="6" w:type="dxa"/>
+              <w:start w:w="16" w:type="dxa"/>
+              <w:bottom w:w="6" w:type="dxa"/>
+              <w:end w:w="16" w:type="dxa"/>
+            </w:tcMar>
+            <w:vAlign w:val="top"/>
           </w:tcPr>
           <w:p>
             <w:pPr>
-              <w:spacing w:after="0"/>
+              <w:spacing w:before="66" w:after="0" w:line="209" w:lineRule="exact"/>
+              <w:ind w:left="64"/>
+              <w:jc w:val="left"/>
             </w:pPr>
             <w:r>
               <w:rPr>
-                <w:rFonts w:ascii="Arial" w:hAnsi="Arial"/>
-                <w:sz w:val="16"/>
+                <w:rFonts w:ascii="Helvetica" w:hAnsi="Helvetica"/>
+                <w:b w:val="0"/>
+                <w:i w:val="0"/>
+                <w:sz w:val="15"/>
               </w:rPr>
               <w:t>124,50</w:t>
             </w:r>
@@ -219,16 +410,27 @@
         </w:tc>
         <w:tc>
           <w:tcPr>
-            <w:tcW w:type="dxa" w:w="2880"/>
+            <w:tcW w:type="dxa" w:w="3100"/>
+            <w:tcMar>
+              <w:top w:w="6" w:type="dxa"/>
+              <w:start w:w="16" w:type="dxa"/>
+              <w:bottom w:w="6" w:type="dxa"/>
+              <w:end w:w="16" w:type="dxa"/>
+            </w:tcMar>
+            <w:vAlign w:val="top"/>
           </w:tcPr>
           <w:p>
             <w:pPr>
-              <w:spacing w:after="0"/>
+              <w:spacing w:before="66" w:after="0" w:line="209" w:lineRule="exact"/>
+              <w:ind w:left="64"/>
+              <w:jc w:val="left"/>
             </w:pPr>
             <w:r>
               <w:rPr>
-                <w:rFonts w:ascii="Arial" w:hAnsi="Arial"/>
-                <w:sz w:val="16"/>
+                <w:rFonts w:ascii="Helvetica" w:hAnsi="Helvetica"/>
+                <w:b w:val="0"/>
+                <w:i w:val="0"/>
+                <w:sz w:val="15"/>
               </w:rPr>
               <w:t>Donativos colecta primer domingo</w:t>
             </w:r>
@@ -237,20 +439,31 @@
       </w:tr>
       <w:tr>
         <w:trPr>
-          <w:trHeight w:val="893" w:hRule="atLeast"/>
+          <w:trHeight w:val="1034" w:hRule="exact"/>
         </w:trPr>
         <w:tc>
           <w:tcPr>
-            <w:tcW w:type="dxa" w:w="1007"/>
+            <w:tcW w:type="dxa" w:w="1160"/>
+            <w:tcMar>
+              <w:top w:w="6" w:type="dxa"/>
+              <w:start w:w="16" w:type="dxa"/>
+              <w:bottom w:w="6" w:type="dxa"/>
+              <w:end w:w="16" w:type="dxa"/>
+            </w:tcMar>
+            <w:vAlign w:val="top"/>
           </w:tcPr>
           <w:p>
             <w:pPr>
-              <w:spacing w:after="0"/>
+              <w:spacing w:before="66" w:after="0" w:line="209" w:lineRule="exact"/>
+              <w:ind w:left="64"/>
+              <w:jc w:val="left"/>
             </w:pPr>
             <w:r>
               <w:rPr>
-                <w:rFonts w:ascii="Arial" w:hAnsi="Arial"/>
-                <w:sz w:val="16"/>
+                <w:rFonts w:ascii="Helvetica" w:hAnsi="Helvetica"/>
+                <w:b w:val="0"/>
+                <w:i w:val="0"/>
+                <w:sz w:val="15"/>
               </w:rPr>
               <w:t>07/01/26</w:t>
             </w:r>
@@ -258,33 +471,71 @@
         </w:tc>
         <w:tc>
           <w:tcPr>
-            <w:tcW w:type="dxa" w:w="3671"/>
+            <w:tcW w:type="dxa" w:w="4194"/>
+            <w:tcMar>
+              <w:top w:w="6" w:type="dxa"/>
+              <w:start w:w="16" w:type="dxa"/>
+              <w:bottom w:w="6" w:type="dxa"/>
+              <w:end w:w="16" w:type="dxa"/>
+            </w:tcMar>
+            <w:vAlign w:val="top"/>
           </w:tcPr>
           <w:p>
             <w:pPr>
-              <w:spacing w:after="0"/>
+              <w:spacing w:before="66" w:after="7" w:line="209" w:lineRule="exact"/>
+              <w:ind w:left="64"/>
+              <w:jc w:val="left"/>
             </w:pPr>
             <w:r>
               <w:rPr>
-                <w:rFonts w:ascii="Arial" w:hAnsi="Arial"/>
-                <w:sz w:val="16"/>
+                <w:rFonts w:ascii="Helvetica" w:hAnsi="Helvetica"/>
+                <w:b w:val="0"/>
+                <w:i w:val="0"/>
+                <w:sz w:val="15"/>
               </w:rPr>
-              <w:t>CARGO BANCARIO SUMINISTRO ELECTRICO RECINTO ANEXO Y DEPENDENCIAS AUXILIARES</w:t>
+              <w:t>CARGO BANCARIO SUMINISTRO ELECTRICO RECINTO</w:t>
+            </w:r>
+          </w:p>
+          <w:p>
+            <w:pPr>
+              <w:spacing w:before="0" w:after="0" w:line="209" w:lineRule="exact"/>
+              <w:ind w:left="64"/>
+              <w:jc w:val="left"/>
+            </w:pPr>
+            <w:r>
+              <w:rPr>
+                <w:rFonts w:ascii="Helvetica" w:hAnsi="Helvetica"/>
+                <w:b w:val="0"/>
+                <w:i w:val="0"/>
+                <w:sz w:val="15"/>
+              </w:rPr>
+              <w:t>ANEXO Y DEPENDENCIAS AUXILIARES</w:t>
             </w:r>
           </w:p>
         </w:tc>
         <w:tc>
           <w:tcPr>
-            <w:tcW w:type="dxa" w:w="936"/>
+            <w:tcW w:type="dxa" w:w="1246"/>
+            <w:tcMar>
+              <w:top w:w="6" w:type="dxa"/>
+              <w:start w:w="16" w:type="dxa"/>
+              <w:bottom w:w="6" w:type="dxa"/>
+              <w:end w:w="16" w:type="dxa"/>
+            </w:tcMar>
+            <w:vAlign w:val="top"/>
           </w:tcPr>
           <w:p>
             <w:pPr>
-              <w:spacing w:after="0"/>
+              <w:spacing w:before="66" w:after="0" w:line="209" w:lineRule="exact"/>
+              <w:ind w:left="70"/>
+              <w:jc w:val="left"/>
             </w:pPr>
             <w:r>
               <w:rPr>
-                <w:rFonts w:ascii="Arial" w:hAnsi="Arial"/>
-                <w:sz w:val="16"/>
+                <w:rFonts w:ascii="Helvetica" w:hAnsi="Helvetica"/>
+                <w:b w:val="0"/>
+                <w:i w:val="0"/>
+                <w:sz w:val="15"/>
               </w:rPr>
               <w:t>86,42</w:t>
             </w:r>
@@ -292,16 +543,27 @@
         </w:tc>
         <w:tc>
           <w:tcPr>
-            <w:tcW w:type="dxa" w:w="936"/>
+            <w:tcW w:type="dxa" w:w="1240"/>
+            <w:tcMar>
+              <w:top w:w="6" w:type="dxa"/>
+              <w:start w:w="16" w:type="dxa"/>
+              <w:bottom w:w="6" w:type="dxa"/>
+              <w:end w:w="16" w:type="dxa"/>
+            </w:tcMar>
+            <w:vAlign w:val="top"/>
           </w:tcPr>
           <w:p>
             <w:pPr>
-              <w:spacing w:after="0"/>
+              <w:spacing w:before="66" w:after="0" w:line="209" w:lineRule="exact"/>
+              <w:ind w:left="64"/>
+              <w:jc w:val="left"/>
             </w:pPr>
             <w:r>
               <w:rPr>
-                <w:rFonts w:ascii="Arial" w:hAnsi="Arial"/>
-                <w:sz w:val="16"/>
+                <w:rFonts w:ascii="Helvetica" w:hAnsi="Helvetica"/>
+                <w:b w:val="0"/>
+                <w:i w:val="0"/>
+                <w:sz w:val="15"/>
               </w:rPr>
               <w:t>0,00</w:t>
             </w:r>
@@ -309,16 +571,27 @@
         </w:tc>
         <w:tc>
           <w:tcPr>
-            <w:tcW w:type="dxa" w:w="2880"/>
+            <w:tcW w:type="dxa" w:w="3100"/>
+            <w:tcMar>
+              <w:top w:w="6" w:type="dxa"/>
+              <w:start w:w="16" w:type="dxa"/>
+              <w:bottom w:w="6" w:type="dxa"/>
+              <w:end w:w="16" w:type="dxa"/>
+            </w:tcMar>
+            <w:vAlign w:val="top"/>
           </w:tcPr>
           <w:p>
             <w:pPr>
-              <w:spacing w:after="0"/>
+              <w:spacing w:before="66" w:after="0" w:line="209" w:lineRule="exact"/>
+              <w:ind w:left="64"/>
+              <w:jc w:val="left"/>
             </w:pPr>
             <w:r>
               <w:rPr>
-                <w:rFonts w:ascii="Arial" w:hAnsi="Arial"/>
-                <w:sz w:val="16"/>
+                <w:rFonts w:ascii="Helvetica" w:hAnsi="Helvetica"/>
+                <w:b w:val="0"/>
+                <w:i w:val="0"/>
+                <w:sz w:val="15"/>
               </w:rPr>
               <w:t>Factura electricidad parroquia</w:t>
             </w:r>
@@ -327,20 +600,31 @@
       </w:tr>
       <w:tr>
         <w:trPr>
-          <w:trHeight w:val="893" w:hRule="atLeast"/>
+          <w:trHeight w:val="1034" w:hRule="exact"/>
         </w:trPr>
         <w:tc>
           <w:tcPr>
-            <w:tcW w:type="dxa" w:w="1007"/>
+            <w:tcW w:type="dxa" w:w="1160"/>
+            <w:tcMar>
+              <w:top w:w="6" w:type="dxa"/>
+              <w:start w:w="16" w:type="dxa"/>
+              <w:bottom w:w="6" w:type="dxa"/>
+              <w:end w:w="16" w:type="dxa"/>
+            </w:tcMar>
+            <w:vAlign w:val="top"/>
           </w:tcPr>
           <w:p>
             <w:pPr>
-              <w:spacing w:after="0"/>
+              <w:spacing w:before="66" w:after="0" w:line="209" w:lineRule="exact"/>
+              <w:ind w:left="64"/>
+              <w:jc w:val="left"/>
             </w:pPr>
             <w:r>
               <w:rPr>
-                <w:rFonts w:ascii="Arial" w:hAnsi="Arial"/>
-                <w:sz w:val="16"/>
+                <w:rFonts w:ascii="Helvetica" w:hAnsi="Helvetica"/>
+                <w:b w:val="0"/>
+                <w:i w:val="0"/>
+                <w:sz w:val="15"/>
               </w:rPr>
               <w:t>12/01/26</w:t>
             </w:r>
@@ -348,33 +632,71 @@
         </w:tc>
         <w:tc>
           <w:tcPr>
-            <w:tcW w:type="dxa" w:w="3671"/>
+            <w:tcW w:type="dxa" w:w="4194"/>
+            <w:tcMar>
+              <w:top w:w="6" w:type="dxa"/>
+              <w:start w:w="16" w:type="dxa"/>
+              <w:bottom w:w="6" w:type="dxa"/>
+              <w:end w:w="16" w:type="dxa"/>
+            </w:tcMar>
+            <w:vAlign w:val="top"/>
           </w:tcPr>
           <w:p>
             <w:pPr>
-              <w:spacing w:after="0"/>
+              <w:spacing w:before="66" w:after="7" w:line="209" w:lineRule="exact"/>
+              <w:ind w:left="64"/>
+              <w:jc w:val="left"/>
             </w:pPr>
             <w:r>
               <w:rPr>
-                <w:rFonts w:ascii="Arial" w:hAnsi="Arial"/>
-                <w:sz w:val="16"/>
+                <w:rFonts w:ascii="Helvetica" w:hAnsi="Helvetica"/>
+                <w:b w:val="0"/>
+                <w:i w:val="0"/>
+                <w:sz w:val="15"/>
               </w:rPr>
-              <w:t>LIQUIDACION MOVIMIENTOS EFECTIVO CAJA MENOR ACTIVIDAD ORDINARIA SIN DETALLE</w:t>
+              <w:t>LIQUIDACION MOVIMIENTOS EFECTIVO CAJA MENOR</w:t>
+            </w:r>
+          </w:p>
+          <w:p>
+            <w:pPr>
+              <w:spacing w:before="0" w:after="0" w:line="209" w:lineRule="exact"/>
+              <w:ind w:left="64"/>
+              <w:jc w:val="left"/>
+            </w:pPr>
+            <w:r>
+              <w:rPr>
+                <w:rFonts w:ascii="Helvetica" w:hAnsi="Helvetica"/>
+                <w:b w:val="0"/>
+                <w:i w:val="0"/>
+                <w:sz w:val="15"/>
+              </w:rPr>
+              <w:t>ACTIVIDAD ORDINARIA SIN DETALLE</w:t>
             </w:r>
           </w:p>
         </w:tc>
         <w:tc>
           <w:tcPr>
-            <w:tcW w:type="dxa" w:w="936"/>
+            <w:tcW w:type="dxa" w:w="1246"/>
+            <w:tcMar>
+              <w:top w:w="6" w:type="dxa"/>
+              <w:start w:w="16" w:type="dxa"/>
+              <w:bottom w:w="6" w:type="dxa"/>
+              <w:end w:w="16" w:type="dxa"/>
+            </w:tcMar>
+            <w:vAlign w:val="top"/>
           </w:tcPr>
           <w:p>
             <w:pPr>
-              <w:spacing w:after="0"/>
+              <w:spacing w:before="66" w:after="0" w:line="209" w:lineRule="exact"/>
+              <w:ind w:left="70"/>
+              <w:jc w:val="left"/>
             </w:pPr>
             <w:r>
               <w:rPr>
-                <w:rFonts w:ascii="Arial" w:hAnsi="Arial"/>
-                <w:sz w:val="16"/>
+                <w:rFonts w:ascii="Helvetica" w:hAnsi="Helvetica"/>
+                <w:b w:val="0"/>
+                <w:i w:val="0"/>
+                <w:sz w:val="15"/>
               </w:rPr>
               <w:t>32,10</w:t>
             </w:r>
@@ -382,16 +704,27 @@
         </w:tc>
         <w:tc>
           <w:tcPr>
-            <w:tcW w:type="dxa" w:w="936"/>
+            <w:tcW w:type="dxa" w:w="1240"/>
+            <w:tcMar>
+              <w:top w:w="6" w:type="dxa"/>
+              <w:start w:w="16" w:type="dxa"/>
+              <w:bottom w:w="6" w:type="dxa"/>
+              <w:end w:w="16" w:type="dxa"/>
+            </w:tcMar>
+            <w:vAlign w:val="top"/>
           </w:tcPr>
           <w:p>
             <w:pPr>
-              <w:spacing w:after="0"/>
+              <w:spacing w:before="66" w:after="0" w:line="209" w:lineRule="exact"/>
+              <w:ind w:left="64"/>
+              <w:jc w:val="left"/>
             </w:pPr>
             <w:r>
               <w:rPr>
-                <w:rFonts w:ascii="Arial" w:hAnsi="Arial"/>
-                <w:sz w:val="16"/>
+                <w:rFonts w:ascii="Helvetica" w:hAnsi="Helvetica"/>
+                <w:b w:val="0"/>
+                <w:i w:val="0"/>
+                <w:sz w:val="15"/>
               </w:rPr>
               <w:t>0,00</w:t>
             </w:r>
@@ -399,16 +732,27 @@
         </w:tc>
         <w:tc>
           <w:tcPr>
-            <w:tcW w:type="dxa" w:w="2880"/>
+            <w:tcW w:type="dxa" w:w="3100"/>
+            <w:tcMar>
+              <w:top w:w="6" w:type="dxa"/>
+              <w:start w:w="16" w:type="dxa"/>
+              <w:bottom w:w="6" w:type="dxa"/>
+              <w:end w:w="16" w:type="dxa"/>
+            </w:tcMar>
+            <w:vAlign w:val="top"/>
           </w:tcPr>
           <w:p>
             <w:pPr>
-              <w:spacing w:after="0"/>
+              <w:spacing w:before="66" w:after="0" w:line="209" w:lineRule="exact"/>
+              <w:ind w:left="64"/>
+              <w:jc w:val="left"/>
             </w:pPr>
             <w:r>
               <w:rPr>
-                <w:rFonts w:ascii="Arial" w:hAnsi="Arial"/>
-                <w:sz w:val="16"/>
+                <w:rFonts w:ascii="Helvetica" w:hAnsi="Helvetica"/>
+                <w:b w:val="0"/>
+                <w:i w:val="0"/>
+                <w:sz w:val="15"/>
               </w:rPr>
               <w:t>Material limpieza y oficina</w:t>
             </w:r>
@@ -417,20 +761,31 @@
       </w:tr>
       <w:tr>
         <w:trPr>
-          <w:trHeight w:val="893" w:hRule="atLeast"/>
+          <w:trHeight w:val="1034" w:hRule="exact"/>
         </w:trPr>
         <w:tc>
           <w:tcPr>
-            <w:tcW w:type="dxa" w:w="1007"/>
+            <w:tcW w:type="dxa" w:w="1160"/>
+            <w:tcMar>
+              <w:top w:w="6" w:type="dxa"/>
+              <w:start w:w="16" w:type="dxa"/>
+              <w:bottom w:w="6" w:type="dxa"/>
+              <w:end w:w="16" w:type="dxa"/>
+            </w:tcMar>
+            <w:vAlign w:val="top"/>
           </w:tcPr>
           <w:p>
             <w:pPr>
-              <w:spacing w:after="0"/>
+              <w:spacing w:before="66" w:after="0" w:line="209" w:lineRule="exact"/>
+              <w:ind w:left="64"/>
+              <w:jc w:val="left"/>
             </w:pPr>
             <w:r>
               <w:rPr>
-                <w:rFonts w:ascii="Arial" w:hAnsi="Arial"/>
-                <w:sz w:val="16"/>
+                <w:rFonts w:ascii="Helvetica" w:hAnsi="Helvetica"/>
+                <w:b w:val="0"/>
+                <w:i w:val="0"/>
+                <w:sz w:val="15"/>
               </w:rPr>
               <w:t>16/01/26</w:t>
             </w:r>
@@ -438,33 +793,71 @@
         </w:tc>
         <w:tc>
           <w:tcPr>
-            <w:tcW w:type="dxa" w:w="3671"/>
+            <w:tcW w:type="dxa" w:w="4194"/>
+            <w:tcMar>
+              <w:top w:w="6" w:type="dxa"/>
+              <w:start w:w="16" w:type="dxa"/>
+              <w:bottom w:w="6" w:type="dxa"/>
+              <w:end w:w="16" w:type="dxa"/>
+            </w:tcMar>
+            <w:vAlign w:val="top"/>
           </w:tcPr>
           <w:p>
             <w:pPr>
-              <w:spacing w:after="0"/>
+              <w:spacing w:before="66" w:after="7" w:line="209" w:lineRule="exact"/>
+              <w:ind w:left="64"/>
+              <w:jc w:val="left"/>
             </w:pPr>
             <w:r>
               <w:rPr>
-                <w:rFonts w:ascii="Arial" w:hAnsi="Arial"/>
-                <w:sz w:val="16"/>
+                <w:rFonts w:ascii="Helvetica" w:hAnsi="Helvetica"/>
+                <w:b w:val="0"/>
+                <w:i w:val="0"/>
+                <w:sz w:val="15"/>
               </w:rPr>
-              <w:t>INGRESO TRANSFERENCIA AGRUPADA CONCEPTO NO EDITABLE SEGUN PAQUETE CONTABILIDAD</w:t>
+              <w:t>INGRESO TRANSFERENCIA AGRUPADA CONCEPTO NO</w:t>
+            </w:r>
+          </w:p>
+          <w:p>
+            <w:pPr>
+              <w:spacing w:before="0" w:after="0" w:line="209" w:lineRule="exact"/>
+              <w:ind w:left="64"/>
+              <w:jc w:val="left"/>
+            </w:pPr>
+            <w:r>
+              <w:rPr>
+                <w:rFonts w:ascii="Helvetica" w:hAnsi="Helvetica"/>
+                <w:b w:val="0"/>
+                <w:i w:val="0"/>
+                <w:sz w:val="15"/>
+              </w:rPr>
+              <w:t>EDITABLE SEGUN PAQUETE CONTABILIDAD</w:t>
             </w:r>
           </w:p>
         </w:tc>
         <w:tc>
           <w:tcPr>
-            <w:tcW w:type="dxa" w:w="936"/>
+            <w:tcW w:type="dxa" w:w="1246"/>
+            <w:tcMar>
+              <w:top w:w="6" w:type="dxa"/>
+              <w:start w:w="16" w:type="dxa"/>
+              <w:bottom w:w="6" w:type="dxa"/>
+              <w:end w:w="16" w:type="dxa"/>
+            </w:tcMar>
+            <w:vAlign w:val="top"/>
           </w:tcPr>
           <w:p>
             <w:pPr>
-              <w:spacing w:after="0"/>
+              <w:spacing w:before="66" w:after="0" w:line="209" w:lineRule="exact"/>
+              <w:ind w:left="70"/>
+              <w:jc w:val="left"/>
             </w:pPr>
             <w:r>
               <w:rPr>
-                <w:rFonts w:ascii="Arial" w:hAnsi="Arial"/>
-                <w:sz w:val="16"/>
+                <w:rFonts w:ascii="Helvetica" w:hAnsi="Helvetica"/>
+                <w:b w:val="0"/>
+                <w:i w:val="0"/>
+                <w:sz w:val="15"/>
               </w:rPr>
               <w:t>0,00</w:t>
             </w:r>
@@ -472,16 +865,27 @@
         </w:tc>
         <w:tc>
           <w:tcPr>
-            <w:tcW w:type="dxa" w:w="936"/>
+            <w:tcW w:type="dxa" w:w="1240"/>
+            <w:tcMar>
+              <w:top w:w="6" w:type="dxa"/>
+              <w:start w:w="16" w:type="dxa"/>
+              <w:bottom w:w="6" w:type="dxa"/>
+              <w:end w:w="16" w:type="dxa"/>
+            </w:tcMar>
+            <w:vAlign w:val="top"/>
           </w:tcPr>
           <w:p>
             <w:pPr>
-              <w:spacing w:after="0"/>
+              <w:spacing w:before="66" w:after="0" w:line="209" w:lineRule="exact"/>
+              <w:ind w:left="64"/>
+              <w:jc w:val="left"/>
             </w:pPr>
             <w:r>
               <w:rPr>
-                <w:rFonts w:ascii="Arial" w:hAnsi="Arial"/>
-                <w:sz w:val="16"/>
+                <w:rFonts w:ascii="Helvetica" w:hAnsi="Helvetica"/>
+                <w:b w:val="0"/>
+                <w:i w:val="0"/>
+                <w:sz w:val="15"/>
               </w:rPr>
               <w:t>210,00</w:t>
             </w:r>
@@ -489,16 +893,27 @@
         </w:tc>
         <w:tc>
           <w:tcPr>
-            <w:tcW w:type="dxa" w:w="2880"/>
+            <w:tcW w:type="dxa" w:w="3100"/>
+            <w:tcMar>
+              <w:top w:w="6" w:type="dxa"/>
+              <w:start w:w="16" w:type="dxa"/>
+              <w:bottom w:w="6" w:type="dxa"/>
+              <w:end w:w="16" w:type="dxa"/>
+            </w:tcMar>
+            <w:vAlign w:val="top"/>
           </w:tcPr>
           <w:p>
             <w:pPr>
-              <w:spacing w:after="0"/>
+              <w:spacing w:before="66" w:after="0" w:line="209" w:lineRule="exact"/>
+              <w:ind w:left="64"/>
+              <w:jc w:val="left"/>
             </w:pPr>
             <w:r>
               <w:rPr>
-                <w:rFonts w:ascii="Arial" w:hAnsi="Arial"/>
-                <w:sz w:val="16"/>
+                <w:rFonts w:ascii="Helvetica" w:hAnsi="Helvetica"/>
+                <w:b w:val="0"/>
+                <w:i w:val="0"/>
+                <w:sz w:val="15"/>
               </w:rPr>
               <w:t>Aportaciones grupo catequesis</w:t>
             </w:r>
@@ -507,20 +922,31 @@
       </w:tr>
       <w:tr>
         <w:trPr>
-          <w:trHeight w:val="893" w:hRule="atLeast"/>
+          <w:trHeight w:val="1034" w:hRule="exact"/>
         </w:trPr>
         <w:tc>
           <w:tcPr>
-            <w:tcW w:type="dxa" w:w="1007"/>
+            <w:tcW w:type="dxa" w:w="1160"/>
+            <w:tcMar>
+              <w:top w:w="6" w:type="dxa"/>
+              <w:start w:w="16" w:type="dxa"/>
+              <w:bottom w:w="6" w:type="dxa"/>
+              <w:end w:w="16" w:type="dxa"/>
+            </w:tcMar>
+            <w:vAlign w:val="top"/>
           </w:tcPr>
           <w:p>
             <w:pPr>
-              <w:spacing w:after="0"/>
+              <w:spacing w:before="66" w:after="0" w:line="209" w:lineRule="exact"/>
+              <w:ind w:left="64"/>
+              <w:jc w:val="left"/>
             </w:pPr>
             <w:r>
               <w:rPr>
-                <w:rFonts w:ascii="Arial" w:hAnsi="Arial"/>
-                <w:sz w:val="16"/>
+                <w:rFonts w:ascii="Helvetica" w:hAnsi="Helvetica"/>
+                <w:b w:val="0"/>
+                <w:i w:val="0"/>
+                <w:sz w:val="15"/>
               </w:rPr>
               <w:t>21/01/26</w:t>
             </w:r>
@@ -528,33 +954,71 @@
         </w:tc>
         <w:tc>
           <w:tcPr>
-            <w:tcW w:type="dxa" w:w="3671"/>
+            <w:tcW w:type="dxa" w:w="4194"/>
+            <w:tcMar>
+              <w:top w:w="6" w:type="dxa"/>
+              <w:start w:w="16" w:type="dxa"/>
+              <w:bottom w:w="6" w:type="dxa"/>
+              <w:end w:w="16" w:type="dxa"/>
+            </w:tcMar>
+            <w:vAlign w:val="top"/>
           </w:tcPr>
           <w:p>
             <w:pPr>
-              <w:spacing w:after="0"/>
+              <w:spacing w:before="66" w:after="7" w:line="209" w:lineRule="exact"/>
+              <w:ind w:left="64"/>
+              <w:jc w:val="left"/>
             </w:pPr>
             <w:r>
               <w:rPr>
-                <w:rFonts w:ascii="Arial" w:hAnsi="Arial"/>
-                <w:sz w:val="16"/>
+                <w:rFonts w:ascii="Helvetica" w:hAnsi="Helvetica"/>
+                <w:b w:val="0"/>
+                <w:i w:val="0"/>
+                <w:sz w:val="15"/>
               </w:rPr>
-              <w:t>PAGO PROVEEDOR GENERICO MANTENIMIENTO LOCAL SOCIAL PARROQUIAL CODIGO INTERNO 78-A</w:t>
+              <w:t>PAGO PROVEEDOR GENERICO MANTENIMIENTO LOCAL</w:t>
+            </w:r>
+          </w:p>
+          <w:p>
+            <w:pPr>
+              <w:spacing w:before="0" w:after="0" w:line="209" w:lineRule="exact"/>
+              <w:ind w:left="64"/>
+              <w:jc w:val="left"/>
+            </w:pPr>
+            <w:r>
+              <w:rPr>
+                <w:rFonts w:ascii="Helvetica" w:hAnsi="Helvetica"/>
+                <w:b w:val="0"/>
+                <w:i w:val="0"/>
+                <w:sz w:val="15"/>
+              </w:rPr>
+              <w:t>SOCIAL PARROQUIAL CODIGO INTERNO 78-A</w:t>
             </w:r>
           </w:p>
         </w:tc>
         <w:tc>
           <w:tcPr>
-            <w:tcW w:type="dxa" w:w="936"/>
+            <w:tcW w:type="dxa" w:w="1246"/>
+            <w:tcMar>
+              <w:top w:w="6" w:type="dxa"/>
+              <w:start w:w="16" w:type="dxa"/>
+              <w:bottom w:w="6" w:type="dxa"/>
+              <w:end w:w="16" w:type="dxa"/>
+            </w:tcMar>
+            <w:vAlign w:val="top"/>
           </w:tcPr>
           <w:p>
             <w:pPr>
-              <w:spacing w:after="0"/>
+              <w:spacing w:before="66" w:after="0" w:line="209" w:lineRule="exact"/>
+              <w:ind w:left="70"/>
+              <w:jc w:val="left"/>
             </w:pPr>
             <w:r>
               <w:rPr>
-                <w:rFonts w:ascii="Arial" w:hAnsi="Arial"/>
-                <w:sz w:val="16"/>
+                <w:rFonts w:ascii="Helvetica" w:hAnsi="Helvetica"/>
+                <w:b w:val="0"/>
+                <w:i w:val="0"/>
+                <w:sz w:val="15"/>
               </w:rPr>
               <w:t>145,20</w:t>
             </w:r>
@@ -562,16 +1026,27 @@
         </w:tc>
         <w:tc>
           <w:tcPr>
-            <w:tcW w:type="dxa" w:w="936"/>
+            <w:tcW w:type="dxa" w:w="1240"/>
+            <w:tcMar>
+              <w:top w:w="6" w:type="dxa"/>
+              <w:start w:w="16" w:type="dxa"/>
+              <w:bottom w:w="6" w:type="dxa"/>
+              <w:end w:w="16" w:type="dxa"/>
+            </w:tcMar>
+            <w:vAlign w:val="top"/>
           </w:tcPr>
           <w:p>
             <w:pPr>
-              <w:spacing w:after="0"/>
+              <w:spacing w:before="66" w:after="0" w:line="209" w:lineRule="exact"/>
+              <w:ind w:left="64"/>
+              <w:jc w:val="left"/>
             </w:pPr>
             <w:r>
               <w:rPr>
-                <w:rFonts w:ascii="Arial" w:hAnsi="Arial"/>
-                <w:sz w:val="16"/>
+                <w:rFonts w:ascii="Helvetica" w:hAnsi="Helvetica"/>
+                <w:b w:val="0"/>
+                <w:i w:val="0"/>
+                <w:sz w:val="15"/>
               </w:rPr>
               <w:t>0,00</w:t>
             </w:r>
@@ -579,16 +1054,27 @@
         </w:tc>
         <w:tc>
           <w:tcPr>
-            <w:tcW w:type="dxa" w:w="2880"/>
+            <w:tcW w:type="dxa" w:w="3100"/>
+            <w:tcMar>
+              <w:top w:w="6" w:type="dxa"/>
+              <w:start w:w="16" w:type="dxa"/>
+              <w:bottom w:w="6" w:type="dxa"/>
+              <w:end w:w="16" w:type="dxa"/>
+            </w:tcMar>
+            <w:vAlign w:val="top"/>
           </w:tcPr>
           <w:p>
             <w:pPr>
-              <w:spacing w:after="0"/>
+              <w:spacing w:before="66" w:after="0" w:line="209" w:lineRule="exact"/>
+              <w:ind w:left="64"/>
+              <w:jc w:val="left"/>
             </w:pPr>
             <w:r>
               <w:rPr>
-                <w:rFonts w:ascii="Arial" w:hAnsi="Arial"/>
-                <w:sz w:val="16"/>
+                <w:rFonts w:ascii="Helvetica" w:hAnsi="Helvetica"/>
+                <w:b w:val="0"/>
+                <w:i w:val="0"/>
+                <w:sz w:val="15"/>
               </w:rPr>
               <w:t>Reparacion puerta salon parroquial</w:t>
             </w:r>
@@ -597,20 +1083,31 @@
       </w:tr>
       <w:tr>
         <w:trPr>
-          <w:trHeight w:val="893" w:hRule="atLeast"/>
+          <w:trHeight w:val="1034" w:hRule="exact"/>
         </w:trPr>
         <w:tc>
           <w:tcPr>
-            <w:tcW w:type="dxa" w:w="1007"/>
+            <w:tcW w:type="dxa" w:w="1160"/>
+            <w:tcMar>
+              <w:top w:w="6" w:type="dxa"/>
+              <w:start w:w="16" w:type="dxa"/>
+              <w:bottom w:w="6" w:type="dxa"/>
+              <w:end w:w="16" w:type="dxa"/>
+            </w:tcMar>
+            <w:vAlign w:val="top"/>
           </w:tcPr>
           <w:p>
             <w:pPr>
-              <w:spacing w:after="0"/>
+              <w:spacing w:before="66" w:after="0" w:line="209" w:lineRule="exact"/>
+              <w:ind w:left="64"/>
+              <w:jc w:val="left"/>
             </w:pPr>
             <w:r>
               <w:rPr>
-                <w:rFonts w:ascii="Arial" w:hAnsi="Arial"/>
-                <w:sz w:val="16"/>
+                <w:rFonts w:ascii="Helvetica" w:hAnsi="Helvetica"/>
+                <w:b w:val="0"/>
+                <w:i w:val="0"/>
+                <w:sz w:val="15"/>
               </w:rPr>
               <w:t>28/01/26</w:t>
             </w:r>
@@ -618,33 +1115,71 @@
         </w:tc>
         <w:tc>
           <w:tcPr>
-            <w:tcW w:type="dxa" w:w="3671"/>
+            <w:tcW w:type="dxa" w:w="4194"/>
+            <w:tcMar>
+              <w:top w:w="6" w:type="dxa"/>
+              <w:start w:w="16" w:type="dxa"/>
+              <w:bottom w:w="6" w:type="dxa"/>
+              <w:end w:w="16" w:type="dxa"/>
+            </w:tcMar>
+            <w:vAlign w:val="top"/>
           </w:tcPr>
           <w:p>
             <w:pPr>
-              <w:spacing w:after="0"/>
+              <w:spacing w:before="66" w:after="7" w:line="209" w:lineRule="exact"/>
+              <w:ind w:left="64"/>
+              <w:jc w:val="left"/>
             </w:pPr>
             <w:r>
               <w:rPr>
-                <w:rFonts w:ascii="Arial" w:hAnsi="Arial"/>
-                <w:sz w:val="16"/>
+                <w:rFonts w:ascii="Helvetica" w:hAnsi="Helvetica"/>
+                <w:b w:val="0"/>
+                <w:i w:val="0"/>
+                <w:sz w:val="15"/>
               </w:rPr>
-              <w:t>REGULARIZACION FINAL DE PERIODO POR DIFERENCIAS DE REDONDEO Y AJUSTE AUTOMATICO</w:t>
+              <w:t>REGULARIZACION FINAL DE PERIODO POR</w:t>
+            </w:r>
+          </w:p>
+          <w:p>
+            <w:pPr>
+              <w:spacing w:before="0" w:after="0" w:line="209" w:lineRule="exact"/>
+              <w:ind w:left="64"/>
+              <w:jc w:val="left"/>
+            </w:pPr>
+            <w:r>
+              <w:rPr>
+                <w:rFonts w:ascii="Helvetica" w:hAnsi="Helvetica"/>
+                <w:b w:val="0"/>
+                <w:i w:val="0"/>
+                <w:sz w:val="15"/>
+              </w:rPr>
+              <w:t>DIFERENCIAS DE REDONDEO Y AJUSTE AUTOMATICO</w:t>
             </w:r>
           </w:p>
         </w:tc>
         <w:tc>
           <w:tcPr>
-            <w:tcW w:type="dxa" w:w="936"/>
+            <w:tcW w:type="dxa" w:w="1246"/>
+            <w:tcMar>
+              <w:top w:w="6" w:type="dxa"/>
+              <w:start w:w="16" w:type="dxa"/>
+              <w:bottom w:w="6" w:type="dxa"/>
+              <w:end w:w="16" w:type="dxa"/>
+            </w:tcMar>
+            <w:vAlign w:val="top"/>
           </w:tcPr>
           <w:p>
             <w:pPr>
-              <w:spacing w:after="0"/>
+              <w:spacing w:before="66" w:after="0" w:line="209" w:lineRule="exact"/>
+              <w:ind w:left="70"/>
+              <w:jc w:val="left"/>
             </w:pPr>
             <w:r>
               <w:rPr>
-                <w:rFonts w:ascii="Arial" w:hAnsi="Arial"/>
-                <w:sz w:val="16"/>
+                <w:rFonts w:ascii="Helvetica" w:hAnsi="Helvetica"/>
+                <w:b w:val="0"/>
+                <w:i w:val="0"/>
+                <w:sz w:val="15"/>
               </w:rPr>
               <w:t>1,34</w:t>
             </w:r>
@@ -652,16 +1187,27 @@
         </w:tc>
         <w:tc>
           <w:tcPr>
-            <w:tcW w:type="dxa" w:w="936"/>
+            <w:tcW w:type="dxa" w:w="1240"/>
+            <w:tcMar>
+              <w:top w:w="6" w:type="dxa"/>
+              <w:start w:w="16" w:type="dxa"/>
+              <w:bottom w:w="6" w:type="dxa"/>
+              <w:end w:w="16" w:type="dxa"/>
+            </w:tcMar>
+            <w:vAlign w:val="top"/>
           </w:tcPr>
           <w:p>
             <w:pPr>
-              <w:spacing w:after="0"/>
+              <w:spacing w:before="66" w:after="0" w:line="209" w:lineRule="exact"/>
+              <w:ind w:left="64"/>
+              <w:jc w:val="left"/>
             </w:pPr>
             <w:r>
               <w:rPr>
-                <w:rFonts w:ascii="Arial" w:hAnsi="Arial"/>
-                <w:sz w:val="16"/>
+                <w:rFonts w:ascii="Helvetica" w:hAnsi="Helvetica"/>
+                <w:b w:val="0"/>
+                <w:i w:val="0"/>
+                <w:sz w:val="15"/>
               </w:rPr>
               <w:t>0,00</w:t>
             </w:r>
@@ -669,16 +1215,27 @@
         </w:tc>
         <w:tc>
           <w:tcPr>
-            <w:tcW w:type="dxa" w:w="2880"/>
+            <w:tcW w:type="dxa" w:w="3100"/>
+            <w:tcMar>
+              <w:top w:w="6" w:type="dxa"/>
+              <w:start w:w="16" w:type="dxa"/>
+              <w:bottom w:w="6" w:type="dxa"/>
+              <w:end w:w="16" w:type="dxa"/>
+            </w:tcMar>
+            <w:vAlign w:val="top"/>
           </w:tcPr>
           <w:p>
             <w:pPr>
-              <w:spacing w:after="0"/>
+              <w:spacing w:before="66" w:after="0" w:line="209" w:lineRule="exact"/>
+              <w:ind w:left="64"/>
+              <w:jc w:val="left"/>
             </w:pPr>
             <w:r>
               <w:rPr>
-                <w:rFonts w:ascii="Arial" w:hAnsi="Arial"/>
-                <w:sz w:val="16"/>
+                <w:rFonts w:ascii="Helvetica" w:hAnsi="Helvetica"/>
+                <w:b w:val="0"/>
+                <w:i w:val="0"/>
+                <w:sz w:val="15"/>
               </w:rPr>
               <w:t>Ajuste contable menor</w:t>
             </w:r>
@@ -686,36 +1243,85 @@
         </w:tc>
       </w:tr>
     </w:tbl>
-    <w:p/>
+    <w:p>
+      <w:pPr>
+        <w:spacing w:before="0" w:after="0" w:line="464" w:lineRule="exact"/>
+      </w:pPr>
+    </w:p>
+    <w:p>
+      <w:pPr>
+        <w:spacing w:before="0" w:after="0" w:line="302" w:lineRule="exact"/>
+      </w:pPr>
+      <w:r>
+        <w:rPr>
+          <w:rFonts w:ascii="Helvetica" w:hAnsi="Helvetica"/>
+          <w:b w:val="0"/>
+          <w:i w:val="0"/>
+          <w:sz w:val="22"/>
+        </w:rPr>
+        <w:t>Totales del periodo</w:t>
+      </w:r>
+    </w:p>
+    <w:p>
+      <w:pPr>
+        <w:spacing w:before="0" w:after="0" w:line="242" w:lineRule="exact"/>
+      </w:pPr>
+    </w:p>
     <w:tbl>
       <w:tblPr>
         <w:tblStyle w:val="TableGrid"/>
         <w:tblW w:type="auto" w:w="0"/>
-        <w:jc w:val="center"/>
         <w:tblLayout w:type="fixed"/>
         <w:tblLook w:firstColumn="1" w:firstRow="1" w:lastColumn="0" w:lastRow="0" w:noHBand="0" w:noVBand="1" w:val="04A0"/>
+        <w:tblBorders>
+          <w:top w:val="single" w:sz="4" w:space="0" w:color="595959"/>
+          <w:left w:val="single" w:sz="4" w:space="0" w:color="595959"/>
+          <w:bottom w:val="single" w:sz="4" w:space="0" w:color="595959"/>
+          <w:right w:val="single" w:sz="4" w:space="0" w:color="595959"/>
+          <w:insideH w:val="single" w:sz="4" w:space="0" w:color="595959"/>
+          <w:insideV w:val="single" w:sz="4" w:space="0" w:color="595959"/>
+        </w:tblBorders>
+        <w:tblCellMar>
+          <w:top w:w="6" w:type="dxa"/>
+          <w:left w:w="16" w:type="dxa"/>
+          <w:bottom w:w="6" w:type="dxa"/>
+          <w:right w:w="16" w:type="dxa"/>
+        </w:tblCellMar>
+        <w:tblInd w:w="304" w:type="dxa"/>
       </w:tblPr>
       <w:tblGrid>
-        <w:gridCol w:w="5472"/>
-        <w:gridCol w:w="1944"/>
-        <w:gridCol w:w="1440"/>
+        <w:gridCol w:w="5354"/>
+        <w:gridCol w:w="2186"/>
+        <w:gridCol w:w="2440"/>
       </w:tblGrid>
       <w:tr>
         <w:trPr>
-          <w:trHeight w:val="403" w:hRule="atLeast"/>
+          <w:trHeight w:val="594" w:hRule="exact"/>
         </w:trPr>
         <w:tc>
           <w:tcPr>
-            <w:tcW w:type="dxa" w:w="5472"/>
+            <w:tcW w:type="dxa" w:w="5354"/>
+            <w:shd w:fill="F0F0F0"/>
+            <w:tcMar>
+              <w:top w:w="6" w:type="dxa"/>
+              <w:start w:w="16" w:type="dxa"/>
+              <w:bottom w:w="6" w:type="dxa"/>
+              <w:end w:w="16" w:type="dxa"/>
+            </w:tcMar>
+            <w:vAlign w:val="top"/>
           </w:tcPr>
           <w:p>
             <w:pPr>
-              <w:spacing w:after="0"/>
+              <w:spacing w:before="66" w:after="0" w:line="255" w:lineRule="exact"/>
+              <w:ind w:left="64"/>
+              <w:jc w:val="left"/>
             </w:pPr>
             <w:r>
               <w:rPr>
-                <w:rFonts w:ascii="Arial" w:hAnsi="Arial"/>
-                <w:sz w:val="16"/>
+                <w:rFonts w:ascii="Helvetica" w:hAnsi="Helvetica"/>
+                <w:b w:val="0"/>
+                <w:i w:val="0"/>
+                <w:sz w:val="18"/>
               </w:rPr>
               <w:t>Total gastos</w:t>
             </w:r>
@@ -723,16 +1329,27 @@
         </w:tc>
         <w:tc>
           <w:tcPr>
-            <w:tcW w:type="dxa" w:w="1944"/>
+            <w:tcW w:type="dxa" w:w="2186"/>
+            <w:tcMar>
+              <w:top w:w="6" w:type="dxa"/>
+              <w:start w:w="16" w:type="dxa"/>
+              <w:bottom w:w="6" w:type="dxa"/>
+              <w:end w:w="16" w:type="dxa"/>
+            </w:tcMar>
+            <w:vAlign w:val="top"/>
           </w:tcPr>
           <w:p>
             <w:pPr>
-              <w:spacing w:after="0"/>
+              <w:spacing w:before="66" w:after="0" w:line="255" w:lineRule="exact"/>
+              <w:ind w:left="50"/>
+              <w:jc w:val="left"/>
             </w:pPr>
             <w:r>
               <w:rPr>
-                <w:rFonts w:ascii="Arial" w:hAnsi="Arial"/>
-                <w:sz w:val="16"/>
+                <w:rFonts w:ascii="Helvetica" w:hAnsi="Helvetica"/>
+                <w:b w:val="0"/>
+                <w:i w:val="0"/>
+                <w:sz w:val="18"/>
               </w:rPr>
               <w:t>265,06</w:t>
             </w:r>
@@ -740,16 +1357,27 @@
         </w:tc>
         <w:tc>
           <w:tcPr>
-            <w:tcW w:type="dxa" w:w="1440"/>
+            <w:tcW w:type="dxa" w:w="2440"/>
+            <w:tcMar>
+              <w:top w:w="6" w:type="dxa"/>
+              <w:start w:w="16" w:type="dxa"/>
+              <w:bottom w:w="6" w:type="dxa"/>
+              <w:end w:w="16" w:type="dxa"/>
+            </w:tcMar>
+            <w:vAlign w:val="top"/>
           </w:tcPr>
           <w:p>
             <w:pPr>
-              <w:spacing w:after="0"/>
+              <w:spacing w:before="66" w:after="0" w:line="255" w:lineRule="exact"/>
+              <w:ind w:left="64"/>
+              <w:jc w:val="left"/>
             </w:pPr>
             <w:r>
               <w:rPr>
-                <w:rFonts w:ascii="Arial" w:hAnsi="Arial"/>
-                <w:sz w:val="16"/>
+                <w:rFonts w:ascii="Helvetica" w:hAnsi="Helvetica"/>
+                <w:b w:val="0"/>
+                <w:i w:val="0"/>
+                <w:sz w:val="18"/>
               </w:rPr>
               <w:t>EUR</w:t>
             </w:r>
@@ -758,20 +1386,32 @@
       </w:tr>
       <w:tr>
         <w:trPr>
-          <w:trHeight w:val="403" w:hRule="atLeast"/>
+          <w:trHeight w:val="594" w:hRule="exact"/>
         </w:trPr>
         <w:tc>
           <w:tcPr>
-            <w:tcW w:type="dxa" w:w="5472"/>
+            <w:tcW w:type="dxa" w:w="5354"/>
+            <w:shd w:fill="F0F0F0"/>
+            <w:tcMar>
+              <w:top w:w="6" w:type="dxa"/>
+              <w:start w:w="16" w:type="dxa"/>
+              <w:bottom w:w="6" w:type="dxa"/>
+              <w:end w:w="16" w:type="dxa"/>
+            </w:tcMar>
+            <w:vAlign w:val="top"/>
           </w:tcPr>
           <w:p>
             <w:pPr>
-              <w:spacing w:after="0"/>
+              <w:spacing w:before="66" w:after="0" w:line="255" w:lineRule="exact"/>
+              <w:ind w:left="64"/>
+              <w:jc w:val="left"/>
             </w:pPr>
             <w:r>
               <w:rPr>
-                <w:rFonts w:ascii="Arial" w:hAnsi="Arial"/>
-                <w:sz w:val="16"/>
+                <w:rFonts w:ascii="Helvetica" w:hAnsi="Helvetica"/>
+                <w:b w:val="0"/>
+                <w:i w:val="0"/>
+                <w:sz w:val="18"/>
               </w:rPr>
               <w:t>Total ingresos</w:t>
             </w:r>
@@ -779,16 +1419,27 @@
         </w:tc>
         <w:tc>
           <w:tcPr>
-            <w:tcW w:type="dxa" w:w="1944"/>
+            <w:tcW w:type="dxa" w:w="2186"/>
+            <w:tcMar>
+              <w:top w:w="6" w:type="dxa"/>
+              <w:start w:w="16" w:type="dxa"/>
+              <w:bottom w:w="6" w:type="dxa"/>
+              <w:end w:w="16" w:type="dxa"/>
+            </w:tcMar>
+            <w:vAlign w:val="top"/>
           </w:tcPr>
           <w:p>
             <w:pPr>
-              <w:spacing w:after="0"/>
+              <w:spacing w:before="66" w:after="0" w:line="255" w:lineRule="exact"/>
+              <w:ind w:left="50"/>
+              <w:jc w:val="left"/>
             </w:pPr>
             <w:r>
               <w:rPr>
-                <w:rFonts w:ascii="Arial" w:hAnsi="Arial"/>
-                <w:sz w:val="16"/>
+                <w:rFonts w:ascii="Helvetica" w:hAnsi="Helvetica"/>
+                <w:b w:val="0"/>
+                <w:i w:val="0"/>
+                <w:sz w:val="18"/>
               </w:rPr>
               <w:t>334,50</w:t>
             </w:r>
@@ -796,16 +1447,27 @@
         </w:tc>
         <w:tc>
           <w:tcPr>
-            <w:tcW w:type="dxa" w:w="1440"/>
+            <w:tcW w:type="dxa" w:w="2440"/>
+            <w:tcMar>
+              <w:top w:w="6" w:type="dxa"/>
+              <w:start w:w="16" w:type="dxa"/>
+              <w:bottom w:w="6" w:type="dxa"/>
+              <w:end w:w="16" w:type="dxa"/>
+            </w:tcMar>
+            <w:vAlign w:val="top"/>
           </w:tcPr>
           <w:p>
             <w:pPr>
-              <w:spacing w:after="0"/>
+              <w:spacing w:before="66" w:after="0" w:line="255" w:lineRule="exact"/>
+              <w:ind w:left="64"/>
+              <w:jc w:val="left"/>
             </w:pPr>
             <w:r>
               <w:rPr>
-                <w:rFonts w:ascii="Arial" w:hAnsi="Arial"/>
-                <w:sz w:val="16"/>
+                <w:rFonts w:ascii="Helvetica" w:hAnsi="Helvetica"/>
+                <w:b w:val="0"/>
+                <w:i w:val="0"/>
+                <w:sz w:val="18"/>
               </w:rPr>
               <w:t>EUR</w:t>
             </w:r>
@@ -814,20 +1476,32 @@
       </w:tr>
       <w:tr>
         <w:trPr>
-          <w:trHeight w:val="403" w:hRule="atLeast"/>
+          <w:trHeight w:val="594" w:hRule="exact"/>
         </w:trPr>
         <w:tc>
           <w:tcPr>
-            <w:tcW w:type="dxa" w:w="5472"/>
+            <w:tcW w:type="dxa" w:w="5354"/>
+            <w:shd w:fill="DBEDDB"/>
+            <w:tcMar>
+              <w:top w:w="6" w:type="dxa"/>
+              <w:start w:w="16" w:type="dxa"/>
+              <w:bottom w:w="6" w:type="dxa"/>
+              <w:end w:w="16" w:type="dxa"/>
+            </w:tcMar>
+            <w:vAlign w:val="top"/>
           </w:tcPr>
           <w:p>
             <w:pPr>
-              <w:spacing w:after="0"/>
+              <w:spacing w:before="66" w:after="0" w:line="255" w:lineRule="exact"/>
+              <w:ind w:left="64"/>
+              <w:jc w:val="left"/>
             </w:pPr>
             <w:r>
               <w:rPr>
-                <w:rFonts w:ascii="Arial" w:hAnsi="Arial"/>
-                <w:sz w:val="16"/>
+                <w:rFonts w:ascii="Helvetica" w:hAnsi="Helvetica"/>
+                <w:b w:val="0"/>
+                <w:i w:val="0"/>
+                <w:sz w:val="18"/>
               </w:rPr>
               <w:t>Saldo del periodo</w:t>
             </w:r>
@@ -835,16 +1509,28 @@
         </w:tc>
         <w:tc>
           <w:tcPr>
-            <w:tcW w:type="dxa" w:w="1944"/>
+            <w:tcW w:type="dxa" w:w="2186"/>
+            <w:shd w:fill="DBEDDB"/>
+            <w:tcMar>
+              <w:top w:w="6" w:type="dxa"/>
+              <w:start w:w="16" w:type="dxa"/>
+              <w:bottom w:w="6" w:type="dxa"/>
+              <w:end w:w="16" w:type="dxa"/>
+            </w:tcMar>
+            <w:vAlign w:val="top"/>
           </w:tcPr>
           <w:p>
             <w:pPr>
-              <w:spacing w:after="0"/>
+              <w:spacing w:before="66" w:after="0" w:line="255" w:lineRule="exact"/>
+              <w:ind w:left="50"/>
+              <w:jc w:val="left"/>
             </w:pPr>
             <w:r>
               <w:rPr>
-                <w:rFonts w:ascii="Arial" w:hAnsi="Arial"/>
-                <w:sz w:val="16"/>
+                <w:rFonts w:ascii="Helvetica" w:hAnsi="Helvetica"/>
+                <w:b w:val="0"/>
+                <w:i w:val="0"/>
+                <w:sz w:val="18"/>
               </w:rPr>
               <w:t>69,44</w:t>
             </w:r>
@@ -852,16 +1538,28 @@
         </w:tc>
         <w:tc>
           <w:tcPr>
-            <w:tcW w:type="dxa" w:w="1440"/>
+            <w:tcW w:type="dxa" w:w="2440"/>
+            <w:shd w:fill="DBEDDB"/>
+            <w:tcMar>
+              <w:top w:w="6" w:type="dxa"/>
+              <w:start w:w="16" w:type="dxa"/>
+              <w:bottom w:w="6" w:type="dxa"/>
+              <w:end w:w="16" w:type="dxa"/>
+            </w:tcMar>
+            <w:vAlign w:val="top"/>
           </w:tcPr>
           <w:p>
             <w:pPr>
-              <w:spacing w:after="0"/>
+              <w:spacing w:before="66" w:after="0" w:line="255" w:lineRule="exact"/>
+              <w:ind w:left="64"/>
+              <w:jc w:val="left"/>
             </w:pPr>
             <w:r>
               <w:rPr>
-                <w:rFonts w:ascii="Arial" w:hAnsi="Arial"/>
-                <w:sz w:val="16"/>
+                <w:rFonts w:ascii="Helvetica" w:hAnsi="Helvetica"/>
+                <w:b w:val="0"/>
+                <w:i w:val="0"/>
+                <w:sz w:val="18"/>
               </w:rPr>
               <w:t>EUR</w:t>
             </w:r>
@@ -869,18 +1567,47 @@
         </w:tc>
       </w:tr>
     </w:tbl>
-    <w:p/>
     <w:p>
       <w:pPr>
-        <w:spacing w:after="160"/>
+        <w:spacing w:before="0" w:after="0" w:line="344" w:lineRule="exact"/>
+      </w:pPr>
+    </w:p>
+    <w:p>
+      <w:pPr>
+        <w:spacing w:before="0" w:after="0" w:line="220" w:lineRule="exact"/>
       </w:pPr>
       <w:r>
-        <w:t>Notas para la prueba: tras convertir a Word, deberia poder editarse la columna 'Concepto rectificado', cambiar cualquier texto de concepto y conservar una tabla suficientemente legible para imprimir.</w:t>
+        <w:rPr>
+          <w:rFonts w:ascii="Helvetica" w:hAnsi="Helvetica"/>
+          <w:b w:val="0"/>
+          <w:i w:val="0"/>
+          <w:sz w:val="16"/>
+        </w:rPr>
+        <w:t>Notas para la prueba: tras convertir a Word, deberia poder editarse la columna 'Concepto rectificado', cambiar cualquier texto de concepto y</w:t>
+      </w:r>
+    </w:p>
+    <w:p>
+      <w:pPr>
+        <w:spacing w:before="0" w:after="0" w:line="15" w:lineRule="exact"/>
+      </w:pPr>
+    </w:p>
+    <w:p>
+      <w:pPr>
+        <w:spacing w:before="0" w:after="0" w:line="220" w:lineRule="exact"/>
+      </w:pPr>
+      <w:r>
+        <w:rPr>
+          <w:rFonts w:ascii="Helvetica" w:hAnsi="Helvetica"/>
+          <w:b w:val="0"/>
+          <w:i w:val="0"/>
+          <w:sz w:val="16"/>
+        </w:rPr>
+        <w:t>conservar una tabla suficientemente legible para imprimir.</w:t>
       </w:r>
     </w:p>
     <w:sectPr>
-      <w:pgSz w:w="12240" w:h="15840"/>
-      <w:pgMar w:top="648" w:right="648" w:bottom="648" w:left="648" w:header="720" w:footer="720" w:gutter="0"/>
+      <w:pgSz w:w="11900" w:h="16840"/>
+      <w:pgMar w:top="720" w:right="0" w:bottom="240" w:left="960" w:header="720" w:footer="720" w:gutter="0"/>
       <w:cols w:space="720"/>
       <w:docGrid w:linePitch="360"/>
     </w:sectPr>
@@ -1251,9 +1978,12 @@
     <w:name w:val="Normal"/>
     <w:qFormat/>
     <w:rsid w:val="00FC693F"/>
+    <w:pPr>
+      <w:spacing w:before="0" w:after="0"/>
+    </w:pPr>
     <w:rPr>
-      <w:rFonts w:ascii="Arial" w:hAnsi="Arial"/>
-      <w:sz w:val="18"/>
+      <w:rFonts w:ascii="Helvetica" w:hAnsi="Helvetica"/>
+      <w:sz w:val="15"/>
     </w:rPr>
   </w:style>
   <w:style w:type="paragraph" w:styleId="Header">

</xml_diff>